<commit_message>
Add table cleanup functionality
</commit_message>
<xml_diff>
--- a/test/test-document-doc-to-html.docx
+++ b/test/test-document-doc-to-html.docx
@@ -1,6 +1,6 @@
 
 <file path=word/document.xml><?xml version="1.0" encoding="utf-8"?>
-<w:document xmlns:wpc="http://schemas.microsoft.com/office/word/2010/wordprocessingCanvas" xmlns:cx="http://schemas.microsoft.com/office/drawing/2014/chartex" xmlns:cx1="http://schemas.microsoft.com/office/drawing/2015/9/8/chartex" xmlns:cx2="http://schemas.microsoft.com/office/drawing/2015/10/21/chartex" xmlns:cx3="http://schemas.microsoft.com/office/drawing/2016/5/9/chartex" xmlns:cx4="http://schemas.microsoft.com/office/drawing/2016/5/10/chartex" xmlns:cx5="http://schemas.microsoft.com/office/drawing/2016/5/11/chartex" xmlns:cx6="http://schemas.microsoft.com/office/drawing/2016/5/12/chartex" xmlns:cx7="http://schemas.microsoft.com/office/drawing/2016/5/13/chartex" xmlns:cx8="http://schemas.microsoft.com/office/drawing/2016/5/14/chartex" xmlns:mc="http://schemas.openxmlformats.org/markup-compatibility/2006" xmlns:aink="http://schemas.microsoft.com/office/drawing/2016/ink" xmlns:am3d="http://schemas.microsoft.com/office/drawing/2017/model3d" xmlns:o="urn:schemas-microsoft-com:office:office" xmlns:oel="http://schemas.microsoft.com/office/2019/extlst" xmlns:r="http://schemas.openxmlformats.org/officeDocument/2006/relationships" xmlns:m="http://schemas.openxmlformats.org/officeDocument/2006/math" xmlns:v="urn:schemas-microsoft-com:vml" xmlns:wp14="http://schemas.microsoft.com/office/word/2010/wordprocessingDrawing" xmlns:wp="http://schemas.openxmlformats.org/drawingml/2006/wordprocessingDrawing" xmlns:w10="urn:schemas-microsoft-com:office:word" xmlns:w="http://schemas.openxmlformats.org/wordprocessingml/2006/main" xmlns:w14="http://schemas.microsoft.com/office/word/2010/wordml" xmlns:w15="http://schemas.microsoft.com/office/word/2012/wordml" xmlns:w16cex="http://schemas.microsoft.com/office/word/2018/wordml/cex" xmlns:w16cid="http://schemas.microsoft.com/office/word/2016/wordml/cid" xmlns:w16="http://schemas.microsoft.com/office/word/2018/wordml" xmlns:w16du="http://schemas.microsoft.com/office/word/2023/wordml/word16du" xmlns:w16sdtdh="http://schemas.microsoft.com/office/word/2020/wordml/sdtdatahash" xmlns:w16sdtfl="http://schemas.microsoft.com/office/word/2024/wordml/sdtformatlock" xmlns:w16se="http://schemas.microsoft.com/office/word/2015/wordml/symex" xmlns:wpg="http://schemas.microsoft.com/office/word/2010/wordprocessingGroup" xmlns:wpi="http://schemas.microsoft.com/office/word/2010/wordprocessingInk" xmlns:wne="http://schemas.microsoft.com/office/word/2006/wordml" xmlns:wps="http://schemas.microsoft.com/office/word/2010/wordprocessingShape" mc:Ignorable="w14 w15 w16se w16cid w16 w16cex w16sdtdh w16sdtfl w16du wp14">
+<w:document xmlns:wpc="http://schemas.microsoft.com/office/word/2010/wordprocessingCanvas" xmlns:cx="http://schemas.microsoft.com/office/drawing/2014/chartex" xmlns:cx1="http://schemas.microsoft.com/office/drawing/2015/9/8/chartex" xmlns:cx2="http://schemas.microsoft.com/office/drawing/2015/10/21/chartex" xmlns:cx3="http://schemas.microsoft.com/office/drawing/2016/5/9/chartex" xmlns:cx4="http://schemas.microsoft.com/office/drawing/2016/5/10/chartex" xmlns:cx5="http://schemas.microsoft.com/office/drawing/2016/5/11/chartex" xmlns:cx6="http://schemas.microsoft.com/office/drawing/2016/5/12/chartex" xmlns:cx7="http://schemas.microsoft.com/office/drawing/2016/5/13/chartex" xmlns:cx8="http://schemas.microsoft.com/office/drawing/2016/5/14/chartex" xmlns:mc="http://schemas.openxmlformats.org/markup-compatibility/2006" xmlns:aink="http://schemas.microsoft.com/office/drawing/2016/ink" xmlns:am3d="http://schemas.microsoft.com/office/drawing/2017/model3d" xmlns:o="urn:schemas-microsoft-com:office:office" xmlns:oel="http://schemas.microsoft.com/office/2019/extlst" xmlns:r="http://schemas.openxmlformats.org/officeDocument/2006/relationships" xmlns:m="http://schemas.openxmlformats.org/officeDocument/2006/math" xmlns:v="urn:schemas-microsoft-com:vml" xmlns:wp14="http://schemas.microsoft.com/office/word/2010/wordprocessingDrawing" xmlns:wp="http://schemas.openxmlformats.org/drawingml/2006/wordprocessingDrawing" xmlns:w10="urn:schemas-microsoft-com:office:word" xmlns:w="http://schemas.openxmlformats.org/wordprocessingml/2006/main" xmlns:w14="http://schemas.microsoft.com/office/word/2010/wordml" xmlns:w15="http://schemas.microsoft.com/office/word/2012/wordml" xmlns:w16cex="http://schemas.microsoft.com/office/word/2018/wordml/cex" xmlns:w16cid="http://schemas.microsoft.com/office/word/2016/wordml/cid" xmlns:w16="http://schemas.microsoft.com/office/word/2018/wordml" xmlns:w16sdtdh="http://schemas.microsoft.com/office/word/2020/wordml/sdtdatahash" xmlns:w16se="http://schemas.microsoft.com/office/word/2015/wordml/symex" xmlns:wpg="http://schemas.microsoft.com/office/word/2010/wordprocessingGroup" xmlns:wpi="http://schemas.microsoft.com/office/word/2010/wordprocessingInk" xmlns:wne="http://schemas.microsoft.com/office/word/2006/wordml" xmlns:wps="http://schemas.microsoft.com/office/word/2010/wordprocessingShape" mc:Ignorable="w14 w15 w16se w16cid w16 w16cex w16sdtdh wp14">
   <w:body>
     <w:p>
       <w:pPr>
@@ -21,19 +21,7 @@
           <w:rPr>
             <w:rStyle w:val="Hyperlink"/>
           </w:rPr>
-          <w:t>Government of</w:t>
-        </w:r>
-        <w:r>
-          <w:rPr>
-            <w:rStyle w:val="Hyperlink"/>
-          </w:rPr>
-          <w:t xml:space="preserve"> </w:t>
-        </w:r>
-        <w:r>
-          <w:rPr>
-            <w:rStyle w:val="Hyperlink"/>
-          </w:rPr>
-          <w:t>Canada</w:t>
+          <w:t>Government of Canada</w:t>
         </w:r>
       </w:hyperlink>
       <w:r>
@@ -578,15 +566,7 @@
         <w:t>73.0</w:t>
       </w:r>
       <w:r>
-        <w:t xml:space="preserve"> billion </w:t>
-      </w:r>
-      <w:proofErr w:type="gramStart"/>
-      <w:r>
-        <w:t>at</w:t>
-      </w:r>
-      <w:proofErr w:type="gramEnd"/>
-      <w:r>
-        <w:t xml:space="preserve"> March 31, 202</w:t>
+        <w:t xml:space="preserve"> billion at March 31, 202</w:t>
       </w:r>
       <w:r>
         <w:t>3</w:t>
@@ -4627,6 +4607,3368 @@
         <w:spacing w:after="240"/>
       </w:pPr>
     </w:p>
+    <w:p>
+      <w:pPr>
+        <w:pStyle w:val="TableChapterNumber"/>
+      </w:pPr>
+      <w:r>
+        <w:t xml:space="preserve">Table </w:t>
+      </w:r>
+      <w:r>
+        <w:t>2</w:t>
+      </w:r>
+    </w:p>
+    <w:p>
+      <w:pPr>
+        <w:pStyle w:val="TableTitle"/>
+      </w:pPr>
+      <w:r>
+        <w:t xml:space="preserve">Average </w:t>
+      </w:r>
+      <w:r>
+        <w:t>P</w:t>
+      </w:r>
+      <w:r>
+        <w:t xml:space="preserve">rivate </w:t>
+      </w:r>
+      <w:r>
+        <w:t>S</w:t>
+      </w:r>
+      <w:r>
+        <w:t xml:space="preserve">ector </w:t>
+      </w:r>
+      <w:r>
+        <w:t>F</w:t>
+      </w:r>
+      <w:r>
+        <w:t>orecasts</w:t>
+      </w:r>
+    </w:p>
+    <w:p>
+      <w:pPr>
+        <w:pStyle w:val="TableSubTitle"/>
+      </w:pPr>
+      <w:r>
+        <w:t>per</w:t>
+      </w:r>
+      <w:r>
+        <w:t xml:space="preserve"> </w:t>
+      </w:r>
+      <w:r>
+        <w:t>cent</w:t>
+      </w:r>
+    </w:p>
+    <w:tbl>
+      <w:tblPr>
+        <w:tblW w:w="4845" w:type="pct"/>
+        <w:tblBorders>
+          <w:top w:val="single" w:sz="4" w:space="0" w:color="auto"/>
+          <w:left w:val="single" w:sz="4" w:space="0" w:color="auto"/>
+          <w:bottom w:val="single" w:sz="4" w:space="0" w:color="auto"/>
+          <w:right w:val="single" w:sz="4" w:space="0" w:color="auto"/>
+          <w:insideH w:val="single" w:sz="4" w:space="0" w:color="auto"/>
+          <w:insideV w:val="single" w:sz="4" w:space="0" w:color="auto"/>
+        </w:tblBorders>
+        <w:tblLayout w:type="fixed"/>
+        <w:tblLook w:val="04A0" w:firstRow="1" w:lastRow="0" w:firstColumn="1" w:lastColumn="0" w:noHBand="0" w:noVBand="1"/>
+      </w:tblPr>
+      <w:tblGrid>
+        <w:gridCol w:w="4821"/>
+        <w:gridCol w:w="1060"/>
+        <w:gridCol w:w="1060"/>
+        <w:gridCol w:w="1069"/>
+        <w:gridCol w:w="1060"/>
+      </w:tblGrid>
+      <w:tr>
+        <w:tc>
+          <w:tcPr>
+            <w:tcW w:w="5215" w:type="dxa"/>
+            <w:tcBorders>
+              <w:top w:val="single" w:sz="12" w:space="0" w:color="auto"/>
+              <w:left w:val="nil"/>
+              <w:bottom w:val="single" w:sz="4" w:space="0" w:color="auto"/>
+              <w:right w:val="nil"/>
+            </w:tcBorders>
+            <w:tcMar>
+              <w:top w:w="0" w:type="dxa"/>
+              <w:left w:w="60" w:type="dxa"/>
+              <w:bottom w:w="0" w:type="dxa"/>
+              <w:right w:w="60" w:type="dxa"/>
+            </w:tcMar>
+            <w:vAlign w:val="center"/>
+          </w:tcPr>
+          <w:p>
+            <w:pPr>
+              <w:pStyle w:val="TableDateLeft"/>
+            </w:pPr>
+          </w:p>
+        </w:tc>
+        <w:tc>
+          <w:tcPr>
+            <w:tcW w:w="1137" w:type="dxa"/>
+            <w:tcBorders>
+              <w:top w:val="single" w:sz="12" w:space="0" w:color="auto"/>
+              <w:left w:val="nil"/>
+              <w:bottom w:val="single" w:sz="4" w:space="0" w:color="auto"/>
+              <w:right w:val="nil"/>
+            </w:tcBorders>
+            <w:tcMar>
+              <w:top w:w="0" w:type="dxa"/>
+              <w:left w:w="60" w:type="dxa"/>
+              <w:bottom w:w="0" w:type="dxa"/>
+              <w:right w:w="60" w:type="dxa"/>
+            </w:tcMar>
+          </w:tcPr>
+          <w:p>
+            <w:pPr>
+              <w:pStyle w:val="TableDateRight"/>
+            </w:pPr>
+            <w:r>
+              <w:t>202</w:t>
+            </w:r>
+            <w:r>
+              <w:t>1</w:t>
+            </w:r>
+          </w:p>
+        </w:tc>
+        <w:tc>
+          <w:tcPr>
+            <w:tcW w:w="1138" w:type="dxa"/>
+            <w:tcBorders>
+              <w:top w:val="single" w:sz="12" w:space="0" w:color="auto"/>
+              <w:left w:val="nil"/>
+              <w:bottom w:val="single" w:sz="4" w:space="0" w:color="auto"/>
+              <w:right w:val="nil"/>
+            </w:tcBorders>
+            <w:tcMar>
+              <w:top w:w="0" w:type="dxa"/>
+              <w:left w:w="60" w:type="dxa"/>
+              <w:bottom w:w="0" w:type="dxa"/>
+              <w:right w:w="60" w:type="dxa"/>
+            </w:tcMar>
+          </w:tcPr>
+          <w:p>
+            <w:pPr>
+              <w:pStyle w:val="TableDateRight"/>
+            </w:pPr>
+            <w:r>
+              <w:t>202</w:t>
+            </w:r>
+            <w:r>
+              <w:t>2</w:t>
+            </w:r>
+          </w:p>
+        </w:tc>
+        <w:tc>
+          <w:tcPr>
+            <w:tcW w:w="1139" w:type="dxa"/>
+            <w:tcBorders>
+              <w:top w:val="single" w:sz="12" w:space="0" w:color="auto"/>
+              <w:left w:val="nil"/>
+              <w:bottom w:val="single" w:sz="4" w:space="0" w:color="auto"/>
+              <w:right w:val="nil"/>
+            </w:tcBorders>
+          </w:tcPr>
+          <w:p>
+            <w:pPr>
+              <w:pStyle w:val="TableDateRight"/>
+              <w:ind w:right="-76"/>
+            </w:pPr>
+            <w:r>
+              <w:t>202</w:t>
+            </w:r>
+            <w:r>
+              <w:t>3</w:t>
+            </w:r>
+          </w:p>
+        </w:tc>
+        <w:tc>
+          <w:tcPr>
+            <w:tcW w:w="1138" w:type="dxa"/>
+            <w:tcBorders>
+              <w:top w:val="single" w:sz="12" w:space="0" w:color="auto"/>
+              <w:left w:val="nil"/>
+              <w:bottom w:val="single" w:sz="4" w:space="0" w:color="auto"/>
+              <w:right w:val="nil"/>
+            </w:tcBorders>
+            <w:tcMar>
+              <w:top w:w="0" w:type="dxa"/>
+              <w:left w:w="60" w:type="dxa"/>
+              <w:bottom w:w="0" w:type="dxa"/>
+              <w:right w:w="60" w:type="dxa"/>
+            </w:tcMar>
+            <w:vAlign w:val="center"/>
+          </w:tcPr>
+          <w:p>
+            <w:pPr>
+              <w:pStyle w:val="TableDateRight"/>
+            </w:pPr>
+            <w:r>
+              <w:t>202</w:t>
+            </w:r>
+            <w:r>
+              <w:t>4</w:t>
+            </w:r>
+          </w:p>
+        </w:tc>
+      </w:tr>
+      <w:tr>
+        <w:tc>
+          <w:tcPr>
+            <w:tcW w:w="5215" w:type="dxa"/>
+            <w:tcBorders>
+              <w:top w:val="nil"/>
+              <w:left w:val="nil"/>
+              <w:bottom w:val="nil"/>
+              <w:right w:val="nil"/>
+            </w:tcBorders>
+            <w:tcMar>
+              <w:top w:w="0" w:type="dxa"/>
+              <w:left w:w="60" w:type="dxa"/>
+              <w:bottom w:w="0" w:type="dxa"/>
+              <w:right w:w="60" w:type="dxa"/>
+            </w:tcMar>
+            <w:vAlign w:val="bottom"/>
+          </w:tcPr>
+          <w:p>
+            <w:pPr>
+              <w:pStyle w:val="TableTextBold"/>
+              <w:ind w:left="0" w:hanging="56"/>
+            </w:pPr>
+            <w:r>
+              <w:t xml:space="preserve">Real GDP </w:t>
+            </w:r>
+            <w:r>
+              <w:t>g</w:t>
+            </w:r>
+            <w:r>
+              <w:t>rowth</w:t>
+            </w:r>
+          </w:p>
+        </w:tc>
+        <w:tc>
+          <w:tcPr>
+            <w:tcW w:w="1137" w:type="dxa"/>
+            <w:tcBorders>
+              <w:top w:val="nil"/>
+              <w:left w:val="nil"/>
+              <w:bottom w:val="nil"/>
+              <w:right w:val="nil"/>
+            </w:tcBorders>
+            <w:tcMar>
+              <w:top w:w="0" w:type="dxa"/>
+              <w:left w:w="0" w:type="dxa"/>
+              <w:bottom w:w="0" w:type="dxa"/>
+              <w:right w:w="0" w:type="dxa"/>
+            </w:tcMar>
+            <w:vAlign w:val="bottom"/>
+          </w:tcPr>
+          <w:p>
+            <w:pPr>
+              <w:pStyle w:val="TableNumber"/>
+              <w:ind w:right="66"/>
+            </w:pPr>
+          </w:p>
+        </w:tc>
+        <w:tc>
+          <w:tcPr>
+            <w:tcW w:w="1138" w:type="dxa"/>
+            <w:tcBorders>
+              <w:top w:val="nil"/>
+              <w:left w:val="nil"/>
+              <w:bottom w:val="nil"/>
+              <w:right w:val="nil"/>
+            </w:tcBorders>
+            <w:tcMar>
+              <w:top w:w="0" w:type="dxa"/>
+              <w:left w:w="0" w:type="dxa"/>
+              <w:bottom w:w="0" w:type="dxa"/>
+              <w:right w:w="0" w:type="dxa"/>
+            </w:tcMar>
+            <w:vAlign w:val="bottom"/>
+          </w:tcPr>
+          <w:p>
+            <w:pPr>
+              <w:pStyle w:val="TableNumber"/>
+              <w:ind w:right="55"/>
+            </w:pPr>
+          </w:p>
+        </w:tc>
+        <w:tc>
+          <w:tcPr>
+            <w:tcW w:w="1139" w:type="dxa"/>
+            <w:tcBorders>
+              <w:top w:val="nil"/>
+              <w:left w:val="nil"/>
+              <w:bottom w:val="nil"/>
+              <w:right w:val="nil"/>
+            </w:tcBorders>
+            <w:vAlign w:val="bottom"/>
+          </w:tcPr>
+          <w:p>
+            <w:pPr>
+              <w:pStyle w:val="TableNumber"/>
+              <w:ind w:right="-76"/>
+            </w:pPr>
+          </w:p>
+        </w:tc>
+        <w:tc>
+          <w:tcPr>
+            <w:tcW w:w="1138" w:type="dxa"/>
+            <w:tcBorders>
+              <w:top w:val="nil"/>
+              <w:left w:val="nil"/>
+              <w:bottom w:val="nil"/>
+              <w:right w:val="nil"/>
+            </w:tcBorders>
+            <w:tcMar>
+              <w:top w:w="0" w:type="dxa"/>
+              <w:left w:w="0" w:type="dxa"/>
+              <w:bottom w:w="0" w:type="dxa"/>
+              <w:right w:w="0" w:type="dxa"/>
+            </w:tcMar>
+            <w:vAlign w:val="bottom"/>
+          </w:tcPr>
+          <w:p>
+            <w:pPr>
+              <w:pStyle w:val="TableNumber"/>
+              <w:ind w:right="100"/>
+            </w:pPr>
+          </w:p>
+        </w:tc>
+      </w:tr>
+      <w:tr>
+        <w:tc>
+          <w:tcPr>
+            <w:tcW w:w="5215" w:type="dxa"/>
+            <w:tcBorders>
+              <w:top w:val="nil"/>
+              <w:left w:val="nil"/>
+              <w:bottom w:val="nil"/>
+              <w:right w:val="nil"/>
+            </w:tcBorders>
+            <w:tcMar>
+              <w:top w:w="0" w:type="dxa"/>
+              <w:left w:w="60" w:type="dxa"/>
+              <w:bottom w:w="0" w:type="dxa"/>
+              <w:right w:w="60" w:type="dxa"/>
+            </w:tcMar>
+            <w:vAlign w:val="bottom"/>
+          </w:tcPr>
+          <w:p>
+            <w:pPr>
+              <w:pStyle w:val="TableText"/>
+              <w:ind w:left="0" w:hanging="56"/>
+            </w:pPr>
+            <w:r>
+              <w:t>  </w:t>
+            </w:r>
+            <w:r>
+              <w:t>Budget 20</w:t>
+            </w:r>
+            <w:r>
+              <w:t>22</w:t>
+            </w:r>
+          </w:p>
+        </w:tc>
+        <w:tc>
+          <w:tcPr>
+            <w:tcW w:w="1137" w:type="dxa"/>
+            <w:tcBorders>
+              <w:top w:val="nil"/>
+              <w:left w:val="nil"/>
+              <w:bottom w:val="nil"/>
+              <w:right w:val="nil"/>
+            </w:tcBorders>
+            <w:tcMar>
+              <w:top w:w="0" w:type="dxa"/>
+              <w:left w:w="0" w:type="dxa"/>
+              <w:bottom w:w="0" w:type="dxa"/>
+              <w:right w:w="0" w:type="dxa"/>
+            </w:tcMar>
+          </w:tcPr>
+          <w:p>
+            <w:pPr>
+              <w:pStyle w:val="TableNumber"/>
+            </w:pPr>
+            <w:r>
+              <w:t>5.0</w:t>
+            </w:r>
+          </w:p>
+        </w:tc>
+        <w:tc>
+          <w:tcPr>
+            <w:tcW w:w="1138" w:type="dxa"/>
+            <w:tcBorders>
+              <w:top w:val="nil"/>
+              <w:left w:val="nil"/>
+              <w:bottom w:val="nil"/>
+              <w:right w:val="nil"/>
+            </w:tcBorders>
+            <w:tcMar>
+              <w:top w:w="0" w:type="dxa"/>
+              <w:left w:w="0" w:type="dxa"/>
+              <w:bottom w:w="0" w:type="dxa"/>
+              <w:right w:w="0" w:type="dxa"/>
+            </w:tcMar>
+          </w:tcPr>
+          <w:p>
+            <w:pPr>
+              <w:pStyle w:val="TableNumber"/>
+            </w:pPr>
+            <w:r>
+              <w:t>4.1</w:t>
+            </w:r>
+          </w:p>
+        </w:tc>
+        <w:tc>
+          <w:tcPr>
+            <w:tcW w:w="1139" w:type="dxa"/>
+            <w:tcBorders>
+              <w:top w:val="nil"/>
+              <w:left w:val="nil"/>
+              <w:bottom w:val="nil"/>
+              <w:right w:val="nil"/>
+            </w:tcBorders>
+          </w:tcPr>
+          <w:p>
+            <w:pPr>
+              <w:pStyle w:val="TableNumber"/>
+              <w:ind w:right="-76"/>
+            </w:pPr>
+            <w:r>
+              <w:t>3.1</w:t>
+            </w:r>
+          </w:p>
+        </w:tc>
+        <w:tc>
+          <w:tcPr>
+            <w:tcW w:w="1138" w:type="dxa"/>
+            <w:tcBorders>
+              <w:top w:val="nil"/>
+              <w:left w:val="nil"/>
+              <w:bottom w:val="nil"/>
+              <w:right w:val="nil"/>
+            </w:tcBorders>
+            <w:tcMar>
+              <w:top w:w="0" w:type="dxa"/>
+              <w:left w:w="0" w:type="dxa"/>
+              <w:bottom w:w="0" w:type="dxa"/>
+              <w:right w:w="0" w:type="dxa"/>
+            </w:tcMar>
+          </w:tcPr>
+          <w:p>
+            <w:pPr>
+              <w:pStyle w:val="TableNumber"/>
+            </w:pPr>
+            <w:r>
+              <w:t>2.</w:t>
+            </w:r>
+            <w:r>
+              <w:t>0</w:t>
+            </w:r>
+          </w:p>
+        </w:tc>
+      </w:tr>
+      <w:tr>
+        <w:tc>
+          <w:tcPr>
+            <w:tcW w:w="5215" w:type="dxa"/>
+            <w:tcBorders>
+              <w:top w:val="nil"/>
+              <w:left w:val="nil"/>
+              <w:bottom w:val="nil"/>
+              <w:right w:val="nil"/>
+            </w:tcBorders>
+            <w:tcMar>
+              <w:top w:w="0" w:type="dxa"/>
+              <w:left w:w="60" w:type="dxa"/>
+              <w:bottom w:w="0" w:type="dxa"/>
+              <w:right w:w="60" w:type="dxa"/>
+            </w:tcMar>
+            <w:vAlign w:val="bottom"/>
+          </w:tcPr>
+          <w:p>
+            <w:pPr>
+              <w:pStyle w:val="TableText"/>
+              <w:ind w:left="0" w:hanging="56"/>
+              <w:rPr>
+                <w:b/>
+              </w:rPr>
+            </w:pPr>
+            <w:r>
+              <w:t>  </w:t>
+            </w:r>
+            <w:r>
+              <w:t>Budget 202</w:t>
+            </w:r>
+            <w:r>
+              <w:t>3</w:t>
+            </w:r>
+          </w:p>
+        </w:tc>
+        <w:tc>
+          <w:tcPr>
+            <w:tcW w:w="1137" w:type="dxa"/>
+            <w:tcBorders>
+              <w:top w:val="nil"/>
+              <w:left w:val="nil"/>
+              <w:bottom w:val="nil"/>
+              <w:right w:val="nil"/>
+            </w:tcBorders>
+            <w:tcMar>
+              <w:top w:w="0" w:type="dxa"/>
+              <w:left w:w="0" w:type="dxa"/>
+              <w:bottom w:w="0" w:type="dxa"/>
+              <w:right w:w="0" w:type="dxa"/>
+            </w:tcMar>
+          </w:tcPr>
+          <w:p>
+            <w:pPr>
+              <w:pStyle w:val="TableNumber"/>
+            </w:pPr>
+            <w:r>
+              <w:t>5.0</w:t>
+            </w:r>
+          </w:p>
+        </w:tc>
+        <w:tc>
+          <w:tcPr>
+            <w:tcW w:w="1138" w:type="dxa"/>
+            <w:tcBorders>
+              <w:top w:val="nil"/>
+              <w:left w:val="nil"/>
+              <w:bottom w:val="nil"/>
+              <w:right w:val="nil"/>
+            </w:tcBorders>
+            <w:tcMar>
+              <w:top w:w="0" w:type="dxa"/>
+              <w:left w:w="0" w:type="dxa"/>
+              <w:bottom w:w="0" w:type="dxa"/>
+              <w:right w:w="0" w:type="dxa"/>
+            </w:tcMar>
+          </w:tcPr>
+          <w:p>
+            <w:pPr>
+              <w:pStyle w:val="TableNumber"/>
+            </w:pPr>
+            <w:r>
+              <w:t>3.4</w:t>
+            </w:r>
+          </w:p>
+        </w:tc>
+        <w:tc>
+          <w:tcPr>
+            <w:tcW w:w="1139" w:type="dxa"/>
+            <w:tcBorders>
+              <w:top w:val="nil"/>
+              <w:left w:val="nil"/>
+              <w:bottom w:val="nil"/>
+              <w:right w:val="nil"/>
+            </w:tcBorders>
+          </w:tcPr>
+          <w:p>
+            <w:pPr>
+              <w:pStyle w:val="TableNumber"/>
+              <w:ind w:right="-76"/>
+            </w:pPr>
+            <w:r>
+              <w:t>0.3</w:t>
+            </w:r>
+          </w:p>
+        </w:tc>
+        <w:tc>
+          <w:tcPr>
+            <w:tcW w:w="1138" w:type="dxa"/>
+            <w:tcBorders>
+              <w:top w:val="nil"/>
+              <w:left w:val="nil"/>
+              <w:bottom w:val="nil"/>
+              <w:right w:val="nil"/>
+            </w:tcBorders>
+            <w:tcMar>
+              <w:top w:w="0" w:type="dxa"/>
+              <w:left w:w="0" w:type="dxa"/>
+              <w:bottom w:w="0" w:type="dxa"/>
+              <w:right w:w="0" w:type="dxa"/>
+            </w:tcMar>
+          </w:tcPr>
+          <w:p>
+            <w:pPr>
+              <w:pStyle w:val="TableNumber"/>
+            </w:pPr>
+            <w:r>
+              <w:t>1.5</w:t>
+            </w:r>
+          </w:p>
+        </w:tc>
+      </w:tr>
+      <w:tr>
+        <w:tc>
+          <w:tcPr>
+            <w:tcW w:w="5215" w:type="dxa"/>
+            <w:tcBorders>
+              <w:top w:val="nil"/>
+              <w:left w:val="nil"/>
+              <w:bottom w:val="nil"/>
+              <w:right w:val="nil"/>
+            </w:tcBorders>
+            <w:tcMar>
+              <w:top w:w="0" w:type="dxa"/>
+              <w:left w:w="60" w:type="dxa"/>
+              <w:bottom w:w="0" w:type="dxa"/>
+              <w:right w:w="60" w:type="dxa"/>
+            </w:tcMar>
+            <w:vAlign w:val="bottom"/>
+          </w:tcPr>
+          <w:p>
+            <w:pPr>
+              <w:pStyle w:val="TableText"/>
+              <w:ind w:left="0" w:hanging="56"/>
+            </w:pPr>
+            <w:r>
+              <w:t>  Actual</w:t>
+            </w:r>
+          </w:p>
+        </w:tc>
+        <w:tc>
+          <w:tcPr>
+            <w:tcW w:w="1137" w:type="dxa"/>
+            <w:tcBorders>
+              <w:top w:val="nil"/>
+              <w:left w:val="nil"/>
+              <w:bottom w:val="nil"/>
+              <w:right w:val="nil"/>
+            </w:tcBorders>
+            <w:tcMar>
+              <w:top w:w="0" w:type="dxa"/>
+              <w:left w:w="0" w:type="dxa"/>
+              <w:bottom w:w="0" w:type="dxa"/>
+              <w:right w:w="0" w:type="dxa"/>
+            </w:tcMar>
+          </w:tcPr>
+          <w:p>
+            <w:pPr>
+              <w:pStyle w:val="TableNumber"/>
+            </w:pPr>
+            <w:r>
+              <w:t>5.0</w:t>
+            </w:r>
+          </w:p>
+        </w:tc>
+        <w:tc>
+          <w:tcPr>
+            <w:tcW w:w="1138" w:type="dxa"/>
+            <w:tcBorders>
+              <w:top w:val="nil"/>
+              <w:left w:val="nil"/>
+              <w:bottom w:val="nil"/>
+              <w:right w:val="nil"/>
+            </w:tcBorders>
+            <w:tcMar>
+              <w:top w:w="0" w:type="dxa"/>
+              <w:left w:w="0" w:type="dxa"/>
+              <w:bottom w:w="0" w:type="dxa"/>
+              <w:right w:w="0" w:type="dxa"/>
+            </w:tcMar>
+          </w:tcPr>
+          <w:p>
+            <w:pPr>
+              <w:pStyle w:val="TableNumber"/>
+            </w:pPr>
+            <w:r>
+              <w:t>3.4</w:t>
+            </w:r>
+          </w:p>
+        </w:tc>
+        <w:tc>
+          <w:tcPr>
+            <w:tcW w:w="1139" w:type="dxa"/>
+            <w:tcBorders>
+              <w:top w:val="nil"/>
+              <w:left w:val="nil"/>
+              <w:bottom w:val="nil"/>
+              <w:right w:val="nil"/>
+            </w:tcBorders>
+          </w:tcPr>
+          <w:p>
+            <w:pPr>
+              <w:pStyle w:val="TableNumber"/>
+              <w:ind w:right="-76"/>
+            </w:pPr>
+            <w:r>
+              <w:t xml:space="preserve">–       </w:t>
+            </w:r>
+          </w:p>
+        </w:tc>
+        <w:tc>
+          <w:tcPr>
+            <w:tcW w:w="1138" w:type="dxa"/>
+            <w:tcBorders>
+              <w:top w:val="nil"/>
+              <w:left w:val="nil"/>
+              <w:bottom w:val="nil"/>
+              <w:right w:val="nil"/>
+            </w:tcBorders>
+            <w:tcMar>
+              <w:top w:w="0" w:type="dxa"/>
+              <w:left w:w="0" w:type="dxa"/>
+              <w:bottom w:w="0" w:type="dxa"/>
+              <w:right w:w="0" w:type="dxa"/>
+            </w:tcMar>
+          </w:tcPr>
+          <w:p>
+            <w:pPr>
+              <w:pStyle w:val="TableNumber"/>
+            </w:pPr>
+            <w:r>
+              <w:t xml:space="preserve">–       </w:t>
+            </w:r>
+          </w:p>
+        </w:tc>
+      </w:tr>
+      <w:tr>
+        <w:tc>
+          <w:tcPr>
+            <w:tcW w:w="5215" w:type="dxa"/>
+            <w:tcBorders>
+              <w:top w:val="nil"/>
+              <w:left w:val="nil"/>
+              <w:bottom w:val="nil"/>
+              <w:right w:val="nil"/>
+            </w:tcBorders>
+            <w:tcMar>
+              <w:top w:w="0" w:type="dxa"/>
+              <w:left w:w="60" w:type="dxa"/>
+              <w:bottom w:w="0" w:type="dxa"/>
+              <w:right w:w="60" w:type="dxa"/>
+            </w:tcMar>
+            <w:vAlign w:val="bottom"/>
+          </w:tcPr>
+          <w:p>
+            <w:pPr>
+              <w:pStyle w:val="TableTextBold"/>
+              <w:ind w:left="0" w:hanging="56"/>
+            </w:pPr>
+            <w:r>
+              <w:t xml:space="preserve">Nominal GDP </w:t>
+            </w:r>
+            <w:r>
+              <w:t>g</w:t>
+            </w:r>
+            <w:r>
+              <w:t>rowth</w:t>
+            </w:r>
+          </w:p>
+        </w:tc>
+        <w:tc>
+          <w:tcPr>
+            <w:tcW w:w="1137" w:type="dxa"/>
+            <w:tcBorders>
+              <w:top w:val="nil"/>
+              <w:left w:val="nil"/>
+              <w:bottom w:val="nil"/>
+              <w:right w:val="nil"/>
+            </w:tcBorders>
+            <w:tcMar>
+              <w:top w:w="0" w:type="dxa"/>
+              <w:left w:w="0" w:type="dxa"/>
+              <w:bottom w:w="0" w:type="dxa"/>
+              <w:right w:w="0" w:type="dxa"/>
+            </w:tcMar>
+          </w:tcPr>
+          <w:p>
+            <w:pPr>
+              <w:pStyle w:val="TableNumber"/>
+            </w:pPr>
+          </w:p>
+        </w:tc>
+        <w:tc>
+          <w:tcPr>
+            <w:tcW w:w="1138" w:type="dxa"/>
+            <w:tcBorders>
+              <w:top w:val="nil"/>
+              <w:left w:val="nil"/>
+              <w:bottom w:val="nil"/>
+              <w:right w:val="nil"/>
+            </w:tcBorders>
+            <w:tcMar>
+              <w:top w:w="0" w:type="dxa"/>
+              <w:left w:w="0" w:type="dxa"/>
+              <w:bottom w:w="0" w:type="dxa"/>
+              <w:right w:w="0" w:type="dxa"/>
+            </w:tcMar>
+          </w:tcPr>
+          <w:p>
+            <w:pPr>
+              <w:pStyle w:val="TableNumber"/>
+            </w:pPr>
+          </w:p>
+        </w:tc>
+        <w:tc>
+          <w:tcPr>
+            <w:tcW w:w="1139" w:type="dxa"/>
+            <w:tcBorders>
+              <w:top w:val="nil"/>
+              <w:left w:val="nil"/>
+              <w:bottom w:val="nil"/>
+              <w:right w:val="nil"/>
+            </w:tcBorders>
+          </w:tcPr>
+          <w:p>
+            <w:pPr>
+              <w:pStyle w:val="TableNumber"/>
+              <w:ind w:right="-76"/>
+            </w:pPr>
+          </w:p>
+        </w:tc>
+        <w:tc>
+          <w:tcPr>
+            <w:tcW w:w="1138" w:type="dxa"/>
+            <w:tcBorders>
+              <w:top w:val="nil"/>
+              <w:left w:val="nil"/>
+              <w:bottom w:val="nil"/>
+              <w:right w:val="nil"/>
+            </w:tcBorders>
+            <w:tcMar>
+              <w:top w:w="0" w:type="dxa"/>
+              <w:left w:w="0" w:type="dxa"/>
+              <w:bottom w:w="0" w:type="dxa"/>
+              <w:right w:w="0" w:type="dxa"/>
+            </w:tcMar>
+          </w:tcPr>
+          <w:p>
+            <w:pPr>
+              <w:pStyle w:val="TableNumber"/>
+            </w:pPr>
+          </w:p>
+        </w:tc>
+      </w:tr>
+      <w:tr>
+        <w:tc>
+          <w:tcPr>
+            <w:tcW w:w="5215" w:type="dxa"/>
+            <w:tcBorders>
+              <w:top w:val="nil"/>
+              <w:left w:val="nil"/>
+              <w:bottom w:val="nil"/>
+              <w:right w:val="nil"/>
+            </w:tcBorders>
+            <w:tcMar>
+              <w:top w:w="0" w:type="dxa"/>
+              <w:left w:w="60" w:type="dxa"/>
+              <w:bottom w:w="0" w:type="dxa"/>
+              <w:right w:w="60" w:type="dxa"/>
+            </w:tcMar>
+            <w:vAlign w:val="bottom"/>
+          </w:tcPr>
+          <w:p>
+            <w:pPr>
+              <w:pStyle w:val="TableText"/>
+              <w:ind w:left="0" w:hanging="56"/>
+            </w:pPr>
+            <w:r>
+              <w:t>  </w:t>
+            </w:r>
+            <w:r>
+              <w:t>Budget 20</w:t>
+            </w:r>
+            <w:r>
+              <w:t>22</w:t>
+            </w:r>
+          </w:p>
+        </w:tc>
+        <w:tc>
+          <w:tcPr>
+            <w:tcW w:w="1137" w:type="dxa"/>
+            <w:tcBorders>
+              <w:top w:val="nil"/>
+              <w:left w:val="nil"/>
+              <w:bottom w:val="nil"/>
+              <w:right w:val="nil"/>
+            </w:tcBorders>
+            <w:tcMar>
+              <w:top w:w="0" w:type="dxa"/>
+              <w:left w:w="0" w:type="dxa"/>
+              <w:bottom w:w="0" w:type="dxa"/>
+              <w:right w:w="0" w:type="dxa"/>
+            </w:tcMar>
+          </w:tcPr>
+          <w:p>
+            <w:pPr>
+              <w:pStyle w:val="TableNumber"/>
+            </w:pPr>
+            <w:r>
+              <w:t>13.6</w:t>
+            </w:r>
+          </w:p>
+        </w:tc>
+        <w:tc>
+          <w:tcPr>
+            <w:tcW w:w="1138" w:type="dxa"/>
+            <w:tcBorders>
+              <w:top w:val="nil"/>
+              <w:left w:val="nil"/>
+              <w:bottom w:val="nil"/>
+              <w:right w:val="nil"/>
+            </w:tcBorders>
+            <w:tcMar>
+              <w:top w:w="0" w:type="dxa"/>
+              <w:left w:w="0" w:type="dxa"/>
+              <w:bottom w:w="0" w:type="dxa"/>
+              <w:right w:w="0" w:type="dxa"/>
+            </w:tcMar>
+          </w:tcPr>
+          <w:p>
+            <w:pPr>
+              <w:pStyle w:val="TableNumber"/>
+            </w:pPr>
+            <w:r>
+              <w:t>8.1</w:t>
+            </w:r>
+          </w:p>
+        </w:tc>
+        <w:tc>
+          <w:tcPr>
+            <w:tcW w:w="1139" w:type="dxa"/>
+            <w:tcBorders>
+              <w:top w:val="nil"/>
+              <w:left w:val="nil"/>
+              <w:bottom w:val="nil"/>
+              <w:right w:val="nil"/>
+            </w:tcBorders>
+          </w:tcPr>
+          <w:p>
+            <w:pPr>
+              <w:pStyle w:val="TableNumber"/>
+              <w:ind w:right="-76"/>
+            </w:pPr>
+            <w:r>
+              <w:t>4.8</w:t>
+            </w:r>
+          </w:p>
+        </w:tc>
+        <w:tc>
+          <w:tcPr>
+            <w:tcW w:w="1138" w:type="dxa"/>
+            <w:tcBorders>
+              <w:top w:val="nil"/>
+              <w:left w:val="nil"/>
+              <w:bottom w:val="nil"/>
+              <w:right w:val="nil"/>
+            </w:tcBorders>
+            <w:tcMar>
+              <w:top w:w="0" w:type="dxa"/>
+              <w:left w:w="0" w:type="dxa"/>
+              <w:bottom w:w="0" w:type="dxa"/>
+              <w:right w:w="0" w:type="dxa"/>
+            </w:tcMar>
+          </w:tcPr>
+          <w:p>
+            <w:pPr>
+              <w:pStyle w:val="TableNumber"/>
+            </w:pPr>
+            <w:r>
+              <w:t>3.9</w:t>
+            </w:r>
+          </w:p>
+        </w:tc>
+      </w:tr>
+      <w:tr>
+        <w:tc>
+          <w:tcPr>
+            <w:tcW w:w="5215" w:type="dxa"/>
+            <w:tcBorders>
+              <w:top w:val="nil"/>
+              <w:left w:val="nil"/>
+              <w:bottom w:val="nil"/>
+              <w:right w:val="nil"/>
+            </w:tcBorders>
+            <w:tcMar>
+              <w:top w:w="0" w:type="dxa"/>
+              <w:left w:w="60" w:type="dxa"/>
+              <w:bottom w:w="0" w:type="dxa"/>
+              <w:right w:w="60" w:type="dxa"/>
+            </w:tcMar>
+            <w:vAlign w:val="bottom"/>
+          </w:tcPr>
+          <w:p>
+            <w:pPr>
+              <w:pStyle w:val="TableText"/>
+              <w:ind w:left="0" w:hanging="56"/>
+              <w:rPr>
+                <w:i/>
+              </w:rPr>
+            </w:pPr>
+            <w:r>
+              <w:t>  </w:t>
+            </w:r>
+            <w:r>
+              <w:t>Budget 202</w:t>
+            </w:r>
+            <w:r>
+              <w:t>3</w:t>
+            </w:r>
+          </w:p>
+        </w:tc>
+        <w:tc>
+          <w:tcPr>
+            <w:tcW w:w="1137" w:type="dxa"/>
+            <w:tcBorders>
+              <w:top w:val="nil"/>
+              <w:left w:val="nil"/>
+              <w:bottom w:val="nil"/>
+              <w:right w:val="nil"/>
+            </w:tcBorders>
+            <w:tcMar>
+              <w:top w:w="0" w:type="dxa"/>
+              <w:left w:w="0" w:type="dxa"/>
+              <w:bottom w:w="0" w:type="dxa"/>
+              <w:right w:w="0" w:type="dxa"/>
+            </w:tcMar>
+          </w:tcPr>
+          <w:p>
+            <w:pPr>
+              <w:pStyle w:val="TableNumber"/>
+            </w:pPr>
+            <w:r>
+              <w:t>13.6</w:t>
+            </w:r>
+          </w:p>
+        </w:tc>
+        <w:tc>
+          <w:tcPr>
+            <w:tcW w:w="1138" w:type="dxa"/>
+            <w:tcBorders>
+              <w:top w:val="nil"/>
+              <w:left w:val="nil"/>
+              <w:bottom w:val="nil"/>
+              <w:right w:val="nil"/>
+            </w:tcBorders>
+            <w:tcMar>
+              <w:top w:w="0" w:type="dxa"/>
+              <w:left w:w="0" w:type="dxa"/>
+              <w:bottom w:w="0" w:type="dxa"/>
+              <w:right w:w="0" w:type="dxa"/>
+            </w:tcMar>
+          </w:tcPr>
+          <w:p>
+            <w:pPr>
+              <w:pStyle w:val="TableNumber"/>
+            </w:pPr>
+            <w:r>
+              <w:t>10.9</w:t>
+            </w:r>
+          </w:p>
+        </w:tc>
+        <w:tc>
+          <w:tcPr>
+            <w:tcW w:w="1139" w:type="dxa"/>
+            <w:tcBorders>
+              <w:top w:val="nil"/>
+              <w:left w:val="nil"/>
+              <w:bottom w:val="nil"/>
+              <w:right w:val="nil"/>
+            </w:tcBorders>
+          </w:tcPr>
+          <w:p>
+            <w:pPr>
+              <w:pStyle w:val="TableNumber"/>
+              <w:ind w:right="-76"/>
+            </w:pPr>
+            <w:r>
+              <w:t>0.8</w:t>
+            </w:r>
+          </w:p>
+        </w:tc>
+        <w:tc>
+          <w:tcPr>
+            <w:tcW w:w="1138" w:type="dxa"/>
+            <w:tcBorders>
+              <w:top w:val="nil"/>
+              <w:left w:val="nil"/>
+              <w:bottom w:val="nil"/>
+              <w:right w:val="nil"/>
+            </w:tcBorders>
+            <w:tcMar>
+              <w:top w:w="0" w:type="dxa"/>
+              <w:left w:w="0" w:type="dxa"/>
+              <w:bottom w:w="0" w:type="dxa"/>
+              <w:right w:w="0" w:type="dxa"/>
+            </w:tcMar>
+          </w:tcPr>
+          <w:p>
+            <w:pPr>
+              <w:pStyle w:val="TableNumber"/>
+            </w:pPr>
+            <w:r>
+              <w:t>3.6</w:t>
+            </w:r>
+          </w:p>
+        </w:tc>
+      </w:tr>
+      <w:tr>
+        <w:tc>
+          <w:tcPr>
+            <w:tcW w:w="5215" w:type="dxa"/>
+            <w:tcBorders>
+              <w:top w:val="nil"/>
+              <w:left w:val="nil"/>
+              <w:bottom w:val="nil"/>
+              <w:right w:val="nil"/>
+            </w:tcBorders>
+            <w:tcMar>
+              <w:top w:w="0" w:type="dxa"/>
+              <w:left w:w="60" w:type="dxa"/>
+              <w:bottom w:w="0" w:type="dxa"/>
+              <w:right w:w="60" w:type="dxa"/>
+            </w:tcMar>
+            <w:vAlign w:val="bottom"/>
+          </w:tcPr>
+          <w:p>
+            <w:pPr>
+              <w:pStyle w:val="TableText"/>
+              <w:ind w:left="0" w:hanging="56"/>
+            </w:pPr>
+            <w:r>
+              <w:t>  Actual</w:t>
+            </w:r>
+          </w:p>
+        </w:tc>
+        <w:tc>
+          <w:tcPr>
+            <w:tcW w:w="1137" w:type="dxa"/>
+            <w:tcBorders>
+              <w:top w:val="nil"/>
+              <w:left w:val="nil"/>
+              <w:bottom w:val="nil"/>
+              <w:right w:val="nil"/>
+            </w:tcBorders>
+            <w:tcMar>
+              <w:top w:w="0" w:type="dxa"/>
+              <w:left w:w="0" w:type="dxa"/>
+              <w:bottom w:w="0" w:type="dxa"/>
+              <w:right w:w="0" w:type="dxa"/>
+            </w:tcMar>
+          </w:tcPr>
+          <w:p>
+            <w:pPr>
+              <w:pStyle w:val="TableNumber"/>
+            </w:pPr>
+            <w:r>
+              <w:t>13.6</w:t>
+            </w:r>
+          </w:p>
+        </w:tc>
+        <w:tc>
+          <w:tcPr>
+            <w:tcW w:w="1138" w:type="dxa"/>
+            <w:tcBorders>
+              <w:top w:val="nil"/>
+              <w:left w:val="nil"/>
+              <w:bottom w:val="nil"/>
+              <w:right w:val="nil"/>
+            </w:tcBorders>
+            <w:tcMar>
+              <w:top w:w="0" w:type="dxa"/>
+              <w:left w:w="0" w:type="dxa"/>
+              <w:bottom w:w="0" w:type="dxa"/>
+              <w:right w:w="0" w:type="dxa"/>
+            </w:tcMar>
+          </w:tcPr>
+          <w:p>
+            <w:pPr>
+              <w:pStyle w:val="TableNumber"/>
+            </w:pPr>
+            <w:r>
+              <w:t>10.9</w:t>
+            </w:r>
+          </w:p>
+        </w:tc>
+        <w:tc>
+          <w:tcPr>
+            <w:tcW w:w="1139" w:type="dxa"/>
+            <w:tcBorders>
+              <w:top w:val="nil"/>
+              <w:left w:val="nil"/>
+              <w:bottom w:val="nil"/>
+              <w:right w:val="nil"/>
+            </w:tcBorders>
+          </w:tcPr>
+          <w:p>
+            <w:pPr>
+              <w:pStyle w:val="TableNumber"/>
+              <w:ind w:right="-76"/>
+            </w:pPr>
+            <w:r>
+              <w:t xml:space="preserve">–       </w:t>
+            </w:r>
+          </w:p>
+        </w:tc>
+        <w:tc>
+          <w:tcPr>
+            <w:tcW w:w="1138" w:type="dxa"/>
+            <w:tcBorders>
+              <w:top w:val="nil"/>
+              <w:left w:val="nil"/>
+              <w:bottom w:val="nil"/>
+              <w:right w:val="nil"/>
+            </w:tcBorders>
+            <w:tcMar>
+              <w:top w:w="0" w:type="dxa"/>
+              <w:left w:w="0" w:type="dxa"/>
+              <w:bottom w:w="0" w:type="dxa"/>
+              <w:right w:w="0" w:type="dxa"/>
+            </w:tcMar>
+          </w:tcPr>
+          <w:p>
+            <w:pPr>
+              <w:pStyle w:val="TableNumber"/>
+            </w:pPr>
+            <w:r>
+              <w:t xml:space="preserve">–       </w:t>
+            </w:r>
+          </w:p>
+        </w:tc>
+      </w:tr>
+      <w:tr>
+        <w:tc>
+          <w:tcPr>
+            <w:tcW w:w="5215" w:type="dxa"/>
+            <w:tcBorders>
+              <w:top w:val="nil"/>
+              <w:left w:val="nil"/>
+              <w:bottom w:val="nil"/>
+              <w:right w:val="nil"/>
+            </w:tcBorders>
+            <w:tcMar>
+              <w:top w:w="0" w:type="dxa"/>
+              <w:left w:w="60" w:type="dxa"/>
+              <w:bottom w:w="0" w:type="dxa"/>
+              <w:right w:w="60" w:type="dxa"/>
+            </w:tcMar>
+            <w:vAlign w:val="bottom"/>
+          </w:tcPr>
+          <w:p>
+            <w:pPr>
+              <w:pStyle w:val="TableTextBold"/>
+              <w:ind w:left="0" w:hanging="56"/>
+            </w:pPr>
+            <w:r>
+              <w:t>3-</w:t>
+            </w:r>
+            <w:r>
+              <w:t>m</w:t>
+            </w:r>
+            <w:r>
+              <w:t xml:space="preserve">onth </w:t>
+            </w:r>
+            <w:r>
+              <w:t>t</w:t>
+            </w:r>
+            <w:r>
+              <w:t xml:space="preserve">reasury </w:t>
+            </w:r>
+            <w:r>
+              <w:t>b</w:t>
+            </w:r>
+            <w:r>
+              <w:t xml:space="preserve">ill </w:t>
+            </w:r>
+            <w:r>
+              <w:t>r</w:t>
+            </w:r>
+            <w:r>
+              <w:t>ate</w:t>
+            </w:r>
+          </w:p>
+        </w:tc>
+        <w:tc>
+          <w:tcPr>
+            <w:tcW w:w="1137" w:type="dxa"/>
+            <w:tcBorders>
+              <w:top w:val="nil"/>
+              <w:left w:val="nil"/>
+              <w:bottom w:val="nil"/>
+              <w:right w:val="nil"/>
+            </w:tcBorders>
+            <w:tcMar>
+              <w:top w:w="0" w:type="dxa"/>
+              <w:left w:w="0" w:type="dxa"/>
+              <w:bottom w:w="0" w:type="dxa"/>
+              <w:right w:w="0" w:type="dxa"/>
+            </w:tcMar>
+          </w:tcPr>
+          <w:p>
+            <w:pPr>
+              <w:pStyle w:val="TableNumber"/>
+            </w:pPr>
+          </w:p>
+        </w:tc>
+        <w:tc>
+          <w:tcPr>
+            <w:tcW w:w="1138" w:type="dxa"/>
+            <w:tcBorders>
+              <w:top w:val="nil"/>
+              <w:left w:val="nil"/>
+              <w:bottom w:val="nil"/>
+              <w:right w:val="nil"/>
+            </w:tcBorders>
+            <w:tcMar>
+              <w:top w:w="0" w:type="dxa"/>
+              <w:left w:w="0" w:type="dxa"/>
+              <w:bottom w:w="0" w:type="dxa"/>
+              <w:right w:w="0" w:type="dxa"/>
+            </w:tcMar>
+          </w:tcPr>
+          <w:p>
+            <w:pPr>
+              <w:pStyle w:val="TableNumber"/>
+            </w:pPr>
+          </w:p>
+        </w:tc>
+        <w:tc>
+          <w:tcPr>
+            <w:tcW w:w="1139" w:type="dxa"/>
+            <w:tcBorders>
+              <w:top w:val="nil"/>
+              <w:left w:val="nil"/>
+              <w:bottom w:val="nil"/>
+              <w:right w:val="nil"/>
+            </w:tcBorders>
+          </w:tcPr>
+          <w:p>
+            <w:pPr>
+              <w:pStyle w:val="TableNumber"/>
+              <w:ind w:right="-76"/>
+            </w:pPr>
+          </w:p>
+        </w:tc>
+        <w:tc>
+          <w:tcPr>
+            <w:tcW w:w="1138" w:type="dxa"/>
+            <w:tcBorders>
+              <w:top w:val="nil"/>
+              <w:left w:val="nil"/>
+              <w:bottom w:val="nil"/>
+              <w:right w:val="nil"/>
+            </w:tcBorders>
+            <w:tcMar>
+              <w:top w:w="0" w:type="dxa"/>
+              <w:left w:w="0" w:type="dxa"/>
+              <w:bottom w:w="0" w:type="dxa"/>
+              <w:right w:w="0" w:type="dxa"/>
+            </w:tcMar>
+          </w:tcPr>
+          <w:p>
+            <w:pPr>
+              <w:pStyle w:val="TableNumber"/>
+            </w:pPr>
+          </w:p>
+        </w:tc>
+      </w:tr>
+      <w:tr>
+        <w:tc>
+          <w:tcPr>
+            <w:tcW w:w="5215" w:type="dxa"/>
+            <w:tcBorders>
+              <w:top w:val="nil"/>
+              <w:left w:val="nil"/>
+              <w:bottom w:val="nil"/>
+              <w:right w:val="nil"/>
+            </w:tcBorders>
+            <w:tcMar>
+              <w:top w:w="0" w:type="dxa"/>
+              <w:left w:w="60" w:type="dxa"/>
+              <w:bottom w:w="0" w:type="dxa"/>
+              <w:right w:w="60" w:type="dxa"/>
+            </w:tcMar>
+            <w:vAlign w:val="bottom"/>
+          </w:tcPr>
+          <w:p>
+            <w:pPr>
+              <w:pStyle w:val="TableText"/>
+              <w:ind w:left="0" w:hanging="56"/>
+            </w:pPr>
+            <w:r>
+              <w:lastRenderedPageBreak/>
+              <w:t>  </w:t>
+            </w:r>
+            <w:r>
+              <w:t>Budget 20</w:t>
+            </w:r>
+            <w:r>
+              <w:t>22</w:t>
+            </w:r>
+          </w:p>
+        </w:tc>
+        <w:tc>
+          <w:tcPr>
+            <w:tcW w:w="1137" w:type="dxa"/>
+            <w:tcBorders>
+              <w:top w:val="nil"/>
+              <w:left w:val="nil"/>
+              <w:bottom w:val="nil"/>
+              <w:right w:val="nil"/>
+            </w:tcBorders>
+            <w:tcMar>
+              <w:top w:w="0" w:type="dxa"/>
+              <w:left w:w="0" w:type="dxa"/>
+              <w:bottom w:w="0" w:type="dxa"/>
+              <w:right w:w="0" w:type="dxa"/>
+            </w:tcMar>
+          </w:tcPr>
+          <w:p>
+            <w:pPr>
+              <w:pStyle w:val="TableNumber"/>
+            </w:pPr>
+            <w:r>
+              <w:t>0.</w:t>
+            </w:r>
+            <w:r>
+              <w:t>1</w:t>
+            </w:r>
+          </w:p>
+        </w:tc>
+        <w:tc>
+          <w:tcPr>
+            <w:tcW w:w="1138" w:type="dxa"/>
+            <w:tcBorders>
+              <w:top w:val="nil"/>
+              <w:left w:val="nil"/>
+              <w:bottom w:val="nil"/>
+              <w:right w:val="nil"/>
+            </w:tcBorders>
+            <w:tcMar>
+              <w:top w:w="0" w:type="dxa"/>
+              <w:left w:w="0" w:type="dxa"/>
+              <w:bottom w:w="0" w:type="dxa"/>
+              <w:right w:w="0" w:type="dxa"/>
+            </w:tcMar>
+          </w:tcPr>
+          <w:p>
+            <w:pPr>
+              <w:pStyle w:val="TableNumber"/>
+            </w:pPr>
+            <w:r>
+              <w:t>0.</w:t>
+            </w:r>
+            <w:r>
+              <w:t>8</w:t>
+            </w:r>
+          </w:p>
+        </w:tc>
+        <w:tc>
+          <w:tcPr>
+            <w:tcW w:w="1139" w:type="dxa"/>
+            <w:tcBorders>
+              <w:top w:val="nil"/>
+              <w:left w:val="nil"/>
+              <w:bottom w:val="nil"/>
+              <w:right w:val="nil"/>
+            </w:tcBorders>
+          </w:tcPr>
+          <w:p>
+            <w:pPr>
+              <w:pStyle w:val="TableNumber"/>
+              <w:ind w:right="-76"/>
+            </w:pPr>
+            <w:r>
+              <w:t>1.7</w:t>
+            </w:r>
+          </w:p>
+        </w:tc>
+        <w:tc>
+          <w:tcPr>
+            <w:tcW w:w="1138" w:type="dxa"/>
+            <w:tcBorders>
+              <w:top w:val="nil"/>
+              <w:left w:val="nil"/>
+              <w:bottom w:val="nil"/>
+              <w:right w:val="nil"/>
+            </w:tcBorders>
+            <w:tcMar>
+              <w:top w:w="0" w:type="dxa"/>
+              <w:left w:w="0" w:type="dxa"/>
+              <w:bottom w:w="0" w:type="dxa"/>
+              <w:right w:w="0" w:type="dxa"/>
+            </w:tcMar>
+          </w:tcPr>
+          <w:p>
+            <w:pPr>
+              <w:pStyle w:val="TableNumber"/>
+              <w:ind w:left="-33" w:firstLine="33"/>
+            </w:pPr>
+            <w:r>
+              <w:t>2.0</w:t>
+            </w:r>
+          </w:p>
+        </w:tc>
+      </w:tr>
+      <w:tr>
+        <w:tc>
+          <w:tcPr>
+            <w:tcW w:w="5215" w:type="dxa"/>
+            <w:tcBorders>
+              <w:top w:val="nil"/>
+              <w:left w:val="nil"/>
+              <w:bottom w:val="nil"/>
+              <w:right w:val="nil"/>
+            </w:tcBorders>
+            <w:tcMar>
+              <w:top w:w="0" w:type="dxa"/>
+              <w:left w:w="60" w:type="dxa"/>
+              <w:bottom w:w="0" w:type="dxa"/>
+              <w:right w:w="60" w:type="dxa"/>
+            </w:tcMar>
+            <w:vAlign w:val="bottom"/>
+          </w:tcPr>
+          <w:p>
+            <w:pPr>
+              <w:pStyle w:val="TableText"/>
+              <w:ind w:left="0" w:hanging="56"/>
+              <w:rPr>
+                <w:i/>
+              </w:rPr>
+            </w:pPr>
+            <w:r>
+              <w:t>  </w:t>
+            </w:r>
+            <w:r>
+              <w:t>Budget 202</w:t>
+            </w:r>
+            <w:r>
+              <w:t>3</w:t>
+            </w:r>
+          </w:p>
+        </w:tc>
+        <w:tc>
+          <w:tcPr>
+            <w:tcW w:w="1137" w:type="dxa"/>
+            <w:tcBorders>
+              <w:top w:val="nil"/>
+              <w:left w:val="nil"/>
+              <w:bottom w:val="nil"/>
+              <w:right w:val="nil"/>
+            </w:tcBorders>
+            <w:tcMar>
+              <w:top w:w="0" w:type="dxa"/>
+              <w:left w:w="0" w:type="dxa"/>
+              <w:bottom w:w="0" w:type="dxa"/>
+              <w:right w:w="0" w:type="dxa"/>
+            </w:tcMar>
+          </w:tcPr>
+          <w:p>
+            <w:pPr>
+              <w:pStyle w:val="TableNumber"/>
+            </w:pPr>
+            <w:r>
+              <w:t>0.</w:t>
+            </w:r>
+            <w:r>
+              <w:t>1</w:t>
+            </w:r>
+          </w:p>
+        </w:tc>
+        <w:tc>
+          <w:tcPr>
+            <w:tcW w:w="1138" w:type="dxa"/>
+            <w:tcBorders>
+              <w:top w:val="nil"/>
+              <w:left w:val="nil"/>
+              <w:bottom w:val="nil"/>
+              <w:right w:val="nil"/>
+            </w:tcBorders>
+            <w:tcMar>
+              <w:top w:w="0" w:type="dxa"/>
+              <w:left w:w="0" w:type="dxa"/>
+              <w:bottom w:w="0" w:type="dxa"/>
+              <w:right w:w="0" w:type="dxa"/>
+            </w:tcMar>
+          </w:tcPr>
+          <w:p>
+            <w:pPr>
+              <w:pStyle w:val="TableNumber"/>
+            </w:pPr>
+            <w:r>
+              <w:t>2.4</w:t>
+            </w:r>
+          </w:p>
+        </w:tc>
+        <w:tc>
+          <w:tcPr>
+            <w:tcW w:w="1139" w:type="dxa"/>
+            <w:tcBorders>
+              <w:top w:val="nil"/>
+              <w:left w:val="nil"/>
+              <w:bottom w:val="nil"/>
+              <w:right w:val="nil"/>
+            </w:tcBorders>
+          </w:tcPr>
+          <w:p>
+            <w:pPr>
+              <w:pStyle w:val="TableNumber"/>
+              <w:ind w:right="-76"/>
+            </w:pPr>
+            <w:r>
+              <w:t>4.4</w:t>
+            </w:r>
+          </w:p>
+        </w:tc>
+        <w:tc>
+          <w:tcPr>
+            <w:tcW w:w="1138" w:type="dxa"/>
+            <w:tcBorders>
+              <w:top w:val="nil"/>
+              <w:left w:val="nil"/>
+              <w:bottom w:val="nil"/>
+              <w:right w:val="nil"/>
+            </w:tcBorders>
+            <w:tcMar>
+              <w:top w:w="0" w:type="dxa"/>
+              <w:left w:w="0" w:type="dxa"/>
+              <w:bottom w:w="0" w:type="dxa"/>
+              <w:right w:w="0" w:type="dxa"/>
+            </w:tcMar>
+          </w:tcPr>
+          <w:p>
+            <w:pPr>
+              <w:pStyle w:val="TableNumber"/>
+            </w:pPr>
+            <w:r>
+              <w:t>3.3</w:t>
+            </w:r>
+          </w:p>
+        </w:tc>
+      </w:tr>
+      <w:tr>
+        <w:tc>
+          <w:tcPr>
+            <w:tcW w:w="5215" w:type="dxa"/>
+            <w:tcBorders>
+              <w:top w:val="nil"/>
+              <w:left w:val="nil"/>
+              <w:bottom w:val="nil"/>
+              <w:right w:val="nil"/>
+            </w:tcBorders>
+            <w:tcMar>
+              <w:top w:w="0" w:type="dxa"/>
+              <w:left w:w="60" w:type="dxa"/>
+              <w:bottom w:w="0" w:type="dxa"/>
+              <w:right w:w="60" w:type="dxa"/>
+            </w:tcMar>
+            <w:vAlign w:val="bottom"/>
+          </w:tcPr>
+          <w:p>
+            <w:pPr>
+              <w:pStyle w:val="TableText"/>
+              <w:ind w:left="0" w:hanging="56"/>
+            </w:pPr>
+            <w:r>
+              <w:t>  Actual</w:t>
+            </w:r>
+          </w:p>
+        </w:tc>
+        <w:tc>
+          <w:tcPr>
+            <w:tcW w:w="1137" w:type="dxa"/>
+            <w:tcBorders>
+              <w:top w:val="nil"/>
+              <w:left w:val="nil"/>
+              <w:bottom w:val="nil"/>
+              <w:right w:val="nil"/>
+            </w:tcBorders>
+            <w:tcMar>
+              <w:top w:w="0" w:type="dxa"/>
+              <w:left w:w="0" w:type="dxa"/>
+              <w:bottom w:w="0" w:type="dxa"/>
+              <w:right w:w="0" w:type="dxa"/>
+            </w:tcMar>
+          </w:tcPr>
+          <w:p>
+            <w:pPr>
+              <w:pStyle w:val="TableNumber"/>
+            </w:pPr>
+            <w:r>
+              <w:t>0.</w:t>
+            </w:r>
+            <w:r>
+              <w:t>1</w:t>
+            </w:r>
+          </w:p>
+        </w:tc>
+        <w:tc>
+          <w:tcPr>
+            <w:tcW w:w="1138" w:type="dxa"/>
+            <w:tcBorders>
+              <w:top w:val="nil"/>
+              <w:left w:val="nil"/>
+              <w:bottom w:val="nil"/>
+              <w:right w:val="nil"/>
+            </w:tcBorders>
+            <w:tcMar>
+              <w:top w:w="0" w:type="dxa"/>
+              <w:left w:w="0" w:type="dxa"/>
+              <w:bottom w:w="0" w:type="dxa"/>
+              <w:right w:w="0" w:type="dxa"/>
+            </w:tcMar>
+          </w:tcPr>
+          <w:p>
+            <w:pPr>
+              <w:pStyle w:val="TableNumber"/>
+            </w:pPr>
+            <w:r>
+              <w:t>2.4</w:t>
+            </w:r>
+          </w:p>
+        </w:tc>
+        <w:tc>
+          <w:tcPr>
+            <w:tcW w:w="1139" w:type="dxa"/>
+            <w:tcBorders>
+              <w:top w:val="nil"/>
+              <w:left w:val="nil"/>
+              <w:bottom w:val="nil"/>
+              <w:right w:val="nil"/>
+            </w:tcBorders>
+          </w:tcPr>
+          <w:p>
+            <w:pPr>
+              <w:pStyle w:val="TableNumber"/>
+              <w:ind w:right="-76"/>
+            </w:pPr>
+            <w:r>
+              <w:t xml:space="preserve">–       </w:t>
+            </w:r>
+          </w:p>
+        </w:tc>
+        <w:tc>
+          <w:tcPr>
+            <w:tcW w:w="1138" w:type="dxa"/>
+            <w:tcBorders>
+              <w:top w:val="nil"/>
+              <w:left w:val="nil"/>
+              <w:bottom w:val="nil"/>
+              <w:right w:val="nil"/>
+            </w:tcBorders>
+            <w:tcMar>
+              <w:top w:w="0" w:type="dxa"/>
+              <w:left w:w="0" w:type="dxa"/>
+              <w:bottom w:w="0" w:type="dxa"/>
+              <w:right w:w="0" w:type="dxa"/>
+            </w:tcMar>
+          </w:tcPr>
+          <w:p>
+            <w:pPr>
+              <w:pStyle w:val="TableNumber"/>
+            </w:pPr>
+            <w:r>
+              <w:t xml:space="preserve">–       </w:t>
+            </w:r>
+          </w:p>
+        </w:tc>
+      </w:tr>
+      <w:tr>
+        <w:tc>
+          <w:tcPr>
+            <w:tcW w:w="5215" w:type="dxa"/>
+            <w:tcBorders>
+              <w:top w:val="nil"/>
+              <w:left w:val="nil"/>
+              <w:bottom w:val="nil"/>
+              <w:right w:val="nil"/>
+            </w:tcBorders>
+            <w:tcMar>
+              <w:top w:w="0" w:type="dxa"/>
+              <w:left w:w="60" w:type="dxa"/>
+              <w:bottom w:w="0" w:type="dxa"/>
+              <w:right w:w="60" w:type="dxa"/>
+            </w:tcMar>
+            <w:vAlign w:val="bottom"/>
+          </w:tcPr>
+          <w:p>
+            <w:pPr>
+              <w:pStyle w:val="TableTextBold"/>
+              <w:ind w:left="0" w:hanging="56"/>
+            </w:pPr>
+            <w:r>
+              <w:t>10-</w:t>
+            </w:r>
+            <w:r>
+              <w:t>y</w:t>
+            </w:r>
+            <w:r>
+              <w:t xml:space="preserve">ear </w:t>
+            </w:r>
+            <w:r>
+              <w:t>g</w:t>
+            </w:r>
+            <w:r>
+              <w:t xml:space="preserve">overnment </w:t>
+            </w:r>
+            <w:r>
+              <w:t>b</w:t>
+            </w:r>
+            <w:r>
+              <w:t xml:space="preserve">ond </w:t>
+            </w:r>
+            <w:r>
+              <w:t>r</w:t>
+            </w:r>
+            <w:r>
+              <w:t>ate</w:t>
+            </w:r>
+          </w:p>
+        </w:tc>
+        <w:tc>
+          <w:tcPr>
+            <w:tcW w:w="1137" w:type="dxa"/>
+            <w:tcBorders>
+              <w:top w:val="nil"/>
+              <w:left w:val="nil"/>
+              <w:bottom w:val="nil"/>
+              <w:right w:val="nil"/>
+            </w:tcBorders>
+            <w:tcMar>
+              <w:top w:w="0" w:type="dxa"/>
+              <w:left w:w="0" w:type="dxa"/>
+              <w:bottom w:w="0" w:type="dxa"/>
+              <w:right w:w="0" w:type="dxa"/>
+            </w:tcMar>
+          </w:tcPr>
+          <w:p>
+            <w:pPr>
+              <w:pStyle w:val="TableNumber"/>
+            </w:pPr>
+          </w:p>
+        </w:tc>
+        <w:tc>
+          <w:tcPr>
+            <w:tcW w:w="1138" w:type="dxa"/>
+            <w:tcBorders>
+              <w:top w:val="nil"/>
+              <w:left w:val="nil"/>
+              <w:bottom w:val="nil"/>
+              <w:right w:val="nil"/>
+            </w:tcBorders>
+            <w:tcMar>
+              <w:top w:w="0" w:type="dxa"/>
+              <w:left w:w="0" w:type="dxa"/>
+              <w:bottom w:w="0" w:type="dxa"/>
+              <w:right w:w="0" w:type="dxa"/>
+            </w:tcMar>
+          </w:tcPr>
+          <w:p>
+            <w:pPr>
+              <w:pStyle w:val="TableNumber"/>
+            </w:pPr>
+          </w:p>
+        </w:tc>
+        <w:tc>
+          <w:tcPr>
+            <w:tcW w:w="1139" w:type="dxa"/>
+            <w:tcBorders>
+              <w:top w:val="nil"/>
+              <w:left w:val="nil"/>
+              <w:bottom w:val="nil"/>
+              <w:right w:val="nil"/>
+            </w:tcBorders>
+          </w:tcPr>
+          <w:p>
+            <w:pPr>
+              <w:pStyle w:val="TableNumber"/>
+              <w:ind w:right="-76"/>
+            </w:pPr>
+          </w:p>
+        </w:tc>
+        <w:tc>
+          <w:tcPr>
+            <w:tcW w:w="1138" w:type="dxa"/>
+            <w:tcBorders>
+              <w:top w:val="nil"/>
+              <w:left w:val="nil"/>
+              <w:bottom w:val="nil"/>
+              <w:right w:val="nil"/>
+            </w:tcBorders>
+            <w:tcMar>
+              <w:top w:w="0" w:type="dxa"/>
+              <w:left w:w="0" w:type="dxa"/>
+              <w:bottom w:w="0" w:type="dxa"/>
+              <w:right w:w="0" w:type="dxa"/>
+            </w:tcMar>
+          </w:tcPr>
+          <w:p>
+            <w:pPr>
+              <w:pStyle w:val="TableNumber"/>
+            </w:pPr>
+          </w:p>
+        </w:tc>
+      </w:tr>
+      <w:tr>
+        <w:tc>
+          <w:tcPr>
+            <w:tcW w:w="5215" w:type="dxa"/>
+            <w:tcBorders>
+              <w:top w:val="nil"/>
+              <w:left w:val="nil"/>
+              <w:bottom w:val="nil"/>
+              <w:right w:val="nil"/>
+            </w:tcBorders>
+            <w:tcMar>
+              <w:top w:w="0" w:type="dxa"/>
+              <w:left w:w="60" w:type="dxa"/>
+              <w:bottom w:w="0" w:type="dxa"/>
+              <w:right w:w="60" w:type="dxa"/>
+            </w:tcMar>
+            <w:vAlign w:val="bottom"/>
+          </w:tcPr>
+          <w:p>
+            <w:pPr>
+              <w:pStyle w:val="TableText"/>
+              <w:ind w:left="0" w:hanging="56"/>
+            </w:pPr>
+            <w:r>
+              <w:t>  </w:t>
+            </w:r>
+            <w:r>
+              <w:t>Budget 20</w:t>
+            </w:r>
+            <w:r>
+              <w:t>22</w:t>
+            </w:r>
+          </w:p>
+        </w:tc>
+        <w:tc>
+          <w:tcPr>
+            <w:tcW w:w="1137" w:type="dxa"/>
+            <w:tcBorders>
+              <w:top w:val="nil"/>
+              <w:left w:val="nil"/>
+              <w:bottom w:val="nil"/>
+              <w:right w:val="nil"/>
+            </w:tcBorders>
+            <w:tcMar>
+              <w:top w:w="0" w:type="dxa"/>
+              <w:left w:w="0" w:type="dxa"/>
+              <w:bottom w:w="0" w:type="dxa"/>
+              <w:right w:w="0" w:type="dxa"/>
+            </w:tcMar>
+          </w:tcPr>
+          <w:p>
+            <w:pPr>
+              <w:pStyle w:val="TableNumber"/>
+            </w:pPr>
+            <w:r>
+              <w:t>1.4</w:t>
+            </w:r>
+          </w:p>
+        </w:tc>
+        <w:tc>
+          <w:tcPr>
+            <w:tcW w:w="1138" w:type="dxa"/>
+            <w:tcBorders>
+              <w:top w:val="nil"/>
+              <w:left w:val="nil"/>
+              <w:bottom w:val="nil"/>
+              <w:right w:val="nil"/>
+            </w:tcBorders>
+            <w:tcMar>
+              <w:top w:w="0" w:type="dxa"/>
+              <w:left w:w="0" w:type="dxa"/>
+              <w:bottom w:w="0" w:type="dxa"/>
+              <w:right w:w="0" w:type="dxa"/>
+            </w:tcMar>
+          </w:tcPr>
+          <w:p>
+            <w:pPr>
+              <w:pStyle w:val="TableNumber"/>
+            </w:pPr>
+            <w:r>
+              <w:t>2.0</w:t>
+            </w:r>
+          </w:p>
+        </w:tc>
+        <w:tc>
+          <w:tcPr>
+            <w:tcW w:w="1139" w:type="dxa"/>
+            <w:tcBorders>
+              <w:top w:val="nil"/>
+              <w:left w:val="nil"/>
+              <w:bottom w:val="nil"/>
+              <w:right w:val="nil"/>
+            </w:tcBorders>
+          </w:tcPr>
+          <w:p>
+            <w:pPr>
+              <w:pStyle w:val="TableNumber"/>
+              <w:ind w:right="-76"/>
+            </w:pPr>
+            <w:r>
+              <w:t>2.4</w:t>
+            </w:r>
+          </w:p>
+        </w:tc>
+        <w:tc>
+          <w:tcPr>
+            <w:tcW w:w="1138" w:type="dxa"/>
+            <w:tcBorders>
+              <w:top w:val="nil"/>
+              <w:left w:val="nil"/>
+              <w:bottom w:val="nil"/>
+              <w:right w:val="nil"/>
+            </w:tcBorders>
+            <w:tcMar>
+              <w:top w:w="0" w:type="dxa"/>
+              <w:left w:w="0" w:type="dxa"/>
+              <w:bottom w:w="0" w:type="dxa"/>
+              <w:right w:w="0" w:type="dxa"/>
+            </w:tcMar>
+          </w:tcPr>
+          <w:p>
+            <w:pPr>
+              <w:pStyle w:val="TableNumber"/>
+            </w:pPr>
+            <w:r>
+              <w:t>2.</w:t>
+            </w:r>
+            <w:r>
+              <w:t>6</w:t>
+            </w:r>
+          </w:p>
+        </w:tc>
+      </w:tr>
+      <w:tr>
+        <w:tc>
+          <w:tcPr>
+            <w:tcW w:w="5215" w:type="dxa"/>
+            <w:tcBorders>
+              <w:top w:val="nil"/>
+              <w:left w:val="nil"/>
+              <w:bottom w:val="nil"/>
+              <w:right w:val="nil"/>
+            </w:tcBorders>
+            <w:tcMar>
+              <w:top w:w="0" w:type="dxa"/>
+              <w:left w:w="60" w:type="dxa"/>
+              <w:bottom w:w="0" w:type="dxa"/>
+              <w:right w:w="60" w:type="dxa"/>
+            </w:tcMar>
+            <w:vAlign w:val="bottom"/>
+          </w:tcPr>
+          <w:p>
+            <w:pPr>
+              <w:pStyle w:val="TableText"/>
+              <w:ind w:left="0" w:hanging="56"/>
+              <w:rPr>
+                <w:i/>
+              </w:rPr>
+            </w:pPr>
+            <w:r>
+              <w:t>  </w:t>
+            </w:r>
+            <w:r>
+              <w:t>Budget 202</w:t>
+            </w:r>
+            <w:r>
+              <w:t>3</w:t>
+            </w:r>
+          </w:p>
+        </w:tc>
+        <w:tc>
+          <w:tcPr>
+            <w:tcW w:w="1137" w:type="dxa"/>
+            <w:tcBorders>
+              <w:top w:val="nil"/>
+              <w:left w:val="nil"/>
+              <w:bottom w:val="nil"/>
+              <w:right w:val="nil"/>
+            </w:tcBorders>
+            <w:tcMar>
+              <w:top w:w="0" w:type="dxa"/>
+              <w:left w:w="0" w:type="dxa"/>
+              <w:bottom w:w="0" w:type="dxa"/>
+              <w:right w:w="0" w:type="dxa"/>
+            </w:tcMar>
+          </w:tcPr>
+          <w:p>
+            <w:pPr>
+              <w:pStyle w:val="TableNumber"/>
+            </w:pPr>
+            <w:r>
+              <w:t>1.4</w:t>
+            </w:r>
+          </w:p>
+        </w:tc>
+        <w:tc>
+          <w:tcPr>
+            <w:tcW w:w="1138" w:type="dxa"/>
+            <w:tcBorders>
+              <w:top w:val="nil"/>
+              <w:left w:val="nil"/>
+              <w:bottom w:val="nil"/>
+              <w:right w:val="nil"/>
+            </w:tcBorders>
+            <w:tcMar>
+              <w:top w:w="0" w:type="dxa"/>
+              <w:left w:w="0" w:type="dxa"/>
+              <w:bottom w:w="0" w:type="dxa"/>
+              <w:right w:w="0" w:type="dxa"/>
+            </w:tcMar>
+          </w:tcPr>
+          <w:p>
+            <w:pPr>
+              <w:pStyle w:val="TableNumber"/>
+            </w:pPr>
+            <w:r>
+              <w:t>2.8</w:t>
+            </w:r>
+          </w:p>
+        </w:tc>
+        <w:tc>
+          <w:tcPr>
+            <w:tcW w:w="1139" w:type="dxa"/>
+            <w:tcBorders>
+              <w:top w:val="nil"/>
+              <w:left w:val="nil"/>
+              <w:bottom w:val="nil"/>
+              <w:right w:val="nil"/>
+            </w:tcBorders>
+          </w:tcPr>
+          <w:p>
+            <w:pPr>
+              <w:pStyle w:val="TableNumber"/>
+              <w:ind w:right="-76"/>
+            </w:pPr>
+            <w:r>
+              <w:t>3</w:t>
+            </w:r>
+            <w:r>
+              <w:t>.0</w:t>
+            </w:r>
+          </w:p>
+        </w:tc>
+        <w:tc>
+          <w:tcPr>
+            <w:tcW w:w="1138" w:type="dxa"/>
+            <w:tcBorders>
+              <w:top w:val="nil"/>
+              <w:left w:val="nil"/>
+              <w:bottom w:val="nil"/>
+              <w:right w:val="nil"/>
+            </w:tcBorders>
+            <w:tcMar>
+              <w:top w:w="0" w:type="dxa"/>
+              <w:left w:w="0" w:type="dxa"/>
+              <w:bottom w:w="0" w:type="dxa"/>
+              <w:right w:w="0" w:type="dxa"/>
+            </w:tcMar>
+          </w:tcPr>
+          <w:p>
+            <w:pPr>
+              <w:pStyle w:val="TableNumber"/>
+            </w:pPr>
+            <w:r>
+              <w:t>2.</w:t>
+            </w:r>
+            <w:r>
+              <w:t>9</w:t>
+            </w:r>
+          </w:p>
+        </w:tc>
+      </w:tr>
+      <w:tr>
+        <w:tc>
+          <w:tcPr>
+            <w:tcW w:w="5215" w:type="dxa"/>
+            <w:tcBorders>
+              <w:top w:val="nil"/>
+              <w:left w:val="nil"/>
+              <w:bottom w:val="nil"/>
+              <w:right w:val="nil"/>
+            </w:tcBorders>
+            <w:tcMar>
+              <w:top w:w="0" w:type="dxa"/>
+              <w:left w:w="60" w:type="dxa"/>
+              <w:bottom w:w="0" w:type="dxa"/>
+              <w:right w:w="60" w:type="dxa"/>
+            </w:tcMar>
+            <w:vAlign w:val="bottom"/>
+          </w:tcPr>
+          <w:p>
+            <w:pPr>
+              <w:pStyle w:val="TableText"/>
+              <w:ind w:left="0" w:hanging="56"/>
+            </w:pPr>
+            <w:r>
+              <w:t>  Actual</w:t>
+            </w:r>
+          </w:p>
+        </w:tc>
+        <w:tc>
+          <w:tcPr>
+            <w:tcW w:w="1137" w:type="dxa"/>
+            <w:tcBorders>
+              <w:top w:val="nil"/>
+              <w:left w:val="nil"/>
+              <w:bottom w:val="nil"/>
+              <w:right w:val="nil"/>
+            </w:tcBorders>
+            <w:tcMar>
+              <w:top w:w="0" w:type="dxa"/>
+              <w:left w:w="0" w:type="dxa"/>
+              <w:bottom w:w="0" w:type="dxa"/>
+              <w:right w:w="0" w:type="dxa"/>
+            </w:tcMar>
+          </w:tcPr>
+          <w:p>
+            <w:pPr>
+              <w:pStyle w:val="TableNumber"/>
+            </w:pPr>
+            <w:r>
+              <w:t>1.4</w:t>
+            </w:r>
+          </w:p>
+        </w:tc>
+        <w:tc>
+          <w:tcPr>
+            <w:tcW w:w="1138" w:type="dxa"/>
+            <w:tcBorders>
+              <w:top w:val="nil"/>
+              <w:left w:val="nil"/>
+              <w:bottom w:val="nil"/>
+              <w:right w:val="nil"/>
+            </w:tcBorders>
+            <w:tcMar>
+              <w:top w:w="0" w:type="dxa"/>
+              <w:left w:w="0" w:type="dxa"/>
+              <w:bottom w:w="0" w:type="dxa"/>
+              <w:right w:w="0" w:type="dxa"/>
+            </w:tcMar>
+          </w:tcPr>
+          <w:p>
+            <w:pPr>
+              <w:pStyle w:val="TableNumber"/>
+            </w:pPr>
+            <w:r>
+              <w:t>2.8</w:t>
+            </w:r>
+          </w:p>
+        </w:tc>
+        <w:tc>
+          <w:tcPr>
+            <w:tcW w:w="1139" w:type="dxa"/>
+            <w:tcBorders>
+              <w:top w:val="nil"/>
+              <w:left w:val="nil"/>
+              <w:bottom w:val="nil"/>
+              <w:right w:val="nil"/>
+            </w:tcBorders>
+          </w:tcPr>
+          <w:p>
+            <w:pPr>
+              <w:pStyle w:val="TableNumber"/>
+              <w:ind w:right="-76"/>
+            </w:pPr>
+            <w:r>
+              <w:t xml:space="preserve">–       </w:t>
+            </w:r>
+          </w:p>
+        </w:tc>
+        <w:tc>
+          <w:tcPr>
+            <w:tcW w:w="1138" w:type="dxa"/>
+            <w:tcBorders>
+              <w:top w:val="nil"/>
+              <w:left w:val="nil"/>
+              <w:bottom w:val="nil"/>
+              <w:right w:val="nil"/>
+            </w:tcBorders>
+            <w:tcMar>
+              <w:top w:w="0" w:type="dxa"/>
+              <w:left w:w="0" w:type="dxa"/>
+              <w:bottom w:w="0" w:type="dxa"/>
+              <w:right w:w="0" w:type="dxa"/>
+            </w:tcMar>
+          </w:tcPr>
+          <w:p>
+            <w:pPr>
+              <w:pStyle w:val="TableNumber"/>
+            </w:pPr>
+            <w:r>
+              <w:t xml:space="preserve">–       </w:t>
+            </w:r>
+          </w:p>
+        </w:tc>
+      </w:tr>
+      <w:tr>
+        <w:tc>
+          <w:tcPr>
+            <w:tcW w:w="5215" w:type="dxa"/>
+            <w:tcBorders>
+              <w:top w:val="nil"/>
+              <w:left w:val="nil"/>
+              <w:bottom w:val="nil"/>
+              <w:right w:val="nil"/>
+            </w:tcBorders>
+            <w:tcMar>
+              <w:top w:w="0" w:type="dxa"/>
+              <w:left w:w="60" w:type="dxa"/>
+              <w:bottom w:w="0" w:type="dxa"/>
+              <w:right w:w="60" w:type="dxa"/>
+            </w:tcMar>
+            <w:vAlign w:val="bottom"/>
+          </w:tcPr>
+          <w:p>
+            <w:pPr>
+              <w:pStyle w:val="TableTextBold"/>
+              <w:ind w:left="0" w:hanging="56"/>
+            </w:pPr>
+            <w:r>
+              <w:t xml:space="preserve">Unemployment </w:t>
+            </w:r>
+            <w:r>
+              <w:t>r</w:t>
+            </w:r>
+            <w:r>
+              <w:t>ate</w:t>
+            </w:r>
+          </w:p>
+        </w:tc>
+        <w:tc>
+          <w:tcPr>
+            <w:tcW w:w="1137" w:type="dxa"/>
+            <w:tcBorders>
+              <w:top w:val="nil"/>
+              <w:left w:val="nil"/>
+              <w:bottom w:val="nil"/>
+              <w:right w:val="nil"/>
+            </w:tcBorders>
+            <w:tcMar>
+              <w:top w:w="0" w:type="dxa"/>
+              <w:left w:w="0" w:type="dxa"/>
+              <w:bottom w:w="0" w:type="dxa"/>
+              <w:right w:w="0" w:type="dxa"/>
+            </w:tcMar>
+          </w:tcPr>
+          <w:p>
+            <w:pPr>
+              <w:pStyle w:val="TableNumber"/>
+            </w:pPr>
+          </w:p>
+        </w:tc>
+        <w:tc>
+          <w:tcPr>
+            <w:tcW w:w="1138" w:type="dxa"/>
+            <w:tcBorders>
+              <w:top w:val="nil"/>
+              <w:left w:val="nil"/>
+              <w:bottom w:val="nil"/>
+              <w:right w:val="nil"/>
+            </w:tcBorders>
+            <w:tcMar>
+              <w:top w:w="0" w:type="dxa"/>
+              <w:left w:w="0" w:type="dxa"/>
+              <w:bottom w:w="0" w:type="dxa"/>
+              <w:right w:w="0" w:type="dxa"/>
+            </w:tcMar>
+          </w:tcPr>
+          <w:p>
+            <w:pPr>
+              <w:pStyle w:val="TableNumber"/>
+            </w:pPr>
+          </w:p>
+        </w:tc>
+        <w:tc>
+          <w:tcPr>
+            <w:tcW w:w="1139" w:type="dxa"/>
+            <w:tcBorders>
+              <w:top w:val="nil"/>
+              <w:left w:val="nil"/>
+              <w:bottom w:val="nil"/>
+              <w:right w:val="nil"/>
+            </w:tcBorders>
+          </w:tcPr>
+          <w:p>
+            <w:pPr>
+              <w:pStyle w:val="TableNumber"/>
+              <w:ind w:right="-76"/>
+            </w:pPr>
+          </w:p>
+        </w:tc>
+        <w:tc>
+          <w:tcPr>
+            <w:tcW w:w="1138" w:type="dxa"/>
+            <w:tcBorders>
+              <w:top w:val="nil"/>
+              <w:left w:val="nil"/>
+              <w:bottom w:val="nil"/>
+              <w:right w:val="nil"/>
+            </w:tcBorders>
+            <w:tcMar>
+              <w:top w:w="0" w:type="dxa"/>
+              <w:left w:w="0" w:type="dxa"/>
+              <w:bottom w:w="0" w:type="dxa"/>
+              <w:right w:w="0" w:type="dxa"/>
+            </w:tcMar>
+          </w:tcPr>
+          <w:p>
+            <w:pPr>
+              <w:pStyle w:val="TableNumber"/>
+            </w:pPr>
+          </w:p>
+        </w:tc>
+      </w:tr>
+      <w:tr>
+        <w:tc>
+          <w:tcPr>
+            <w:tcW w:w="5215" w:type="dxa"/>
+            <w:tcBorders>
+              <w:top w:val="nil"/>
+              <w:left w:val="nil"/>
+              <w:bottom w:val="nil"/>
+              <w:right w:val="nil"/>
+            </w:tcBorders>
+            <w:tcMar>
+              <w:top w:w="0" w:type="dxa"/>
+              <w:left w:w="60" w:type="dxa"/>
+              <w:bottom w:w="0" w:type="dxa"/>
+              <w:right w:w="60" w:type="dxa"/>
+            </w:tcMar>
+            <w:vAlign w:val="bottom"/>
+          </w:tcPr>
+          <w:p>
+            <w:pPr>
+              <w:pStyle w:val="TableText"/>
+              <w:ind w:left="0" w:hanging="56"/>
+            </w:pPr>
+            <w:r>
+              <w:t>  </w:t>
+            </w:r>
+            <w:r>
+              <w:t>Budget 20</w:t>
+            </w:r>
+            <w:r>
+              <w:t>22</w:t>
+            </w:r>
+          </w:p>
+        </w:tc>
+        <w:tc>
+          <w:tcPr>
+            <w:tcW w:w="1137" w:type="dxa"/>
+            <w:tcBorders>
+              <w:top w:val="nil"/>
+              <w:left w:val="nil"/>
+              <w:bottom w:val="nil"/>
+              <w:right w:val="nil"/>
+            </w:tcBorders>
+            <w:tcMar>
+              <w:top w:w="0" w:type="dxa"/>
+              <w:left w:w="0" w:type="dxa"/>
+              <w:bottom w:w="0" w:type="dxa"/>
+              <w:right w:w="0" w:type="dxa"/>
+            </w:tcMar>
+          </w:tcPr>
+          <w:p>
+            <w:pPr>
+              <w:pStyle w:val="TableNumber"/>
+            </w:pPr>
+            <w:r>
+              <w:t>7.5</w:t>
+            </w:r>
+          </w:p>
+        </w:tc>
+        <w:tc>
+          <w:tcPr>
+            <w:tcW w:w="1138" w:type="dxa"/>
+            <w:tcBorders>
+              <w:top w:val="nil"/>
+              <w:left w:val="nil"/>
+              <w:bottom w:val="nil"/>
+              <w:right w:val="nil"/>
+            </w:tcBorders>
+            <w:tcMar>
+              <w:top w:w="0" w:type="dxa"/>
+              <w:left w:w="0" w:type="dxa"/>
+              <w:bottom w:w="0" w:type="dxa"/>
+              <w:right w:w="0" w:type="dxa"/>
+            </w:tcMar>
+          </w:tcPr>
+          <w:p>
+            <w:pPr>
+              <w:pStyle w:val="TableNumber"/>
+            </w:pPr>
+            <w:r>
+              <w:t>5.8</w:t>
+            </w:r>
+          </w:p>
+        </w:tc>
+        <w:tc>
+          <w:tcPr>
+            <w:tcW w:w="1139" w:type="dxa"/>
+            <w:tcBorders>
+              <w:top w:val="nil"/>
+              <w:left w:val="nil"/>
+              <w:bottom w:val="nil"/>
+              <w:right w:val="nil"/>
+            </w:tcBorders>
+          </w:tcPr>
+          <w:p>
+            <w:pPr>
+              <w:pStyle w:val="TableNumber"/>
+              <w:ind w:right="-76"/>
+            </w:pPr>
+            <w:r>
+              <w:t>5</w:t>
+            </w:r>
+            <w:r>
+              <w:t>.5</w:t>
+            </w:r>
+          </w:p>
+        </w:tc>
+        <w:tc>
+          <w:tcPr>
+            <w:tcW w:w="1138" w:type="dxa"/>
+            <w:tcBorders>
+              <w:top w:val="nil"/>
+              <w:left w:val="nil"/>
+              <w:bottom w:val="nil"/>
+              <w:right w:val="nil"/>
+            </w:tcBorders>
+            <w:tcMar>
+              <w:top w:w="0" w:type="dxa"/>
+              <w:left w:w="0" w:type="dxa"/>
+              <w:bottom w:w="0" w:type="dxa"/>
+              <w:right w:w="0" w:type="dxa"/>
+            </w:tcMar>
+          </w:tcPr>
+          <w:p>
+            <w:pPr>
+              <w:pStyle w:val="TableNumber"/>
+            </w:pPr>
+            <w:r>
+              <w:t>5.5</w:t>
+            </w:r>
+          </w:p>
+        </w:tc>
+      </w:tr>
+      <w:tr>
+        <w:tc>
+          <w:tcPr>
+            <w:tcW w:w="5215" w:type="dxa"/>
+            <w:tcBorders>
+              <w:top w:val="nil"/>
+              <w:left w:val="nil"/>
+              <w:bottom w:val="nil"/>
+              <w:right w:val="nil"/>
+            </w:tcBorders>
+            <w:tcMar>
+              <w:top w:w="0" w:type="dxa"/>
+              <w:left w:w="60" w:type="dxa"/>
+              <w:bottom w:w="0" w:type="dxa"/>
+              <w:right w:w="60" w:type="dxa"/>
+            </w:tcMar>
+            <w:vAlign w:val="bottom"/>
+          </w:tcPr>
+          <w:p>
+            <w:pPr>
+              <w:pStyle w:val="TableText"/>
+              <w:ind w:left="0" w:hanging="56"/>
+              <w:rPr>
+                <w:i/>
+              </w:rPr>
+            </w:pPr>
+            <w:r>
+              <w:t>  </w:t>
+            </w:r>
+            <w:r>
+              <w:t>Budget 202</w:t>
+            </w:r>
+            <w:r>
+              <w:t>3</w:t>
+            </w:r>
+          </w:p>
+        </w:tc>
+        <w:tc>
+          <w:tcPr>
+            <w:tcW w:w="1137" w:type="dxa"/>
+            <w:tcBorders>
+              <w:top w:val="nil"/>
+              <w:left w:val="nil"/>
+              <w:bottom w:val="nil"/>
+              <w:right w:val="nil"/>
+            </w:tcBorders>
+            <w:tcMar>
+              <w:top w:w="0" w:type="dxa"/>
+              <w:left w:w="0" w:type="dxa"/>
+              <w:bottom w:w="0" w:type="dxa"/>
+              <w:right w:w="0" w:type="dxa"/>
+            </w:tcMar>
+          </w:tcPr>
+          <w:p>
+            <w:pPr>
+              <w:pStyle w:val="TableNumber"/>
+            </w:pPr>
+            <w:r>
+              <w:t>7.5</w:t>
+            </w:r>
+          </w:p>
+        </w:tc>
+        <w:tc>
+          <w:tcPr>
+            <w:tcW w:w="1138" w:type="dxa"/>
+            <w:tcBorders>
+              <w:top w:val="nil"/>
+              <w:left w:val="nil"/>
+              <w:bottom w:val="nil"/>
+              <w:right w:val="nil"/>
+            </w:tcBorders>
+            <w:tcMar>
+              <w:top w:w="0" w:type="dxa"/>
+              <w:left w:w="0" w:type="dxa"/>
+              <w:bottom w:w="0" w:type="dxa"/>
+              <w:right w:w="0" w:type="dxa"/>
+            </w:tcMar>
+          </w:tcPr>
+          <w:p>
+            <w:pPr>
+              <w:pStyle w:val="TableNumber"/>
+            </w:pPr>
+            <w:r>
+              <w:t>5.3</w:t>
+            </w:r>
+          </w:p>
+        </w:tc>
+        <w:tc>
+          <w:tcPr>
+            <w:tcW w:w="1139" w:type="dxa"/>
+            <w:tcBorders>
+              <w:top w:val="nil"/>
+              <w:left w:val="nil"/>
+              <w:bottom w:val="nil"/>
+              <w:right w:val="nil"/>
+            </w:tcBorders>
+          </w:tcPr>
+          <w:p>
+            <w:pPr>
+              <w:pStyle w:val="TableNumber"/>
+              <w:ind w:right="-76"/>
+            </w:pPr>
+            <w:r>
+              <w:t>5.8</w:t>
+            </w:r>
+          </w:p>
+        </w:tc>
+        <w:tc>
+          <w:tcPr>
+            <w:tcW w:w="1138" w:type="dxa"/>
+            <w:tcBorders>
+              <w:top w:val="nil"/>
+              <w:left w:val="nil"/>
+              <w:bottom w:val="nil"/>
+              <w:right w:val="nil"/>
+            </w:tcBorders>
+            <w:tcMar>
+              <w:top w:w="0" w:type="dxa"/>
+              <w:left w:w="0" w:type="dxa"/>
+              <w:bottom w:w="0" w:type="dxa"/>
+              <w:right w:w="0" w:type="dxa"/>
+            </w:tcMar>
+          </w:tcPr>
+          <w:p>
+            <w:pPr>
+              <w:pStyle w:val="TableNumber"/>
+            </w:pPr>
+            <w:r>
+              <w:t>6.2</w:t>
+            </w:r>
+          </w:p>
+        </w:tc>
+      </w:tr>
+      <w:tr>
+        <w:tc>
+          <w:tcPr>
+            <w:tcW w:w="5215" w:type="dxa"/>
+            <w:tcBorders>
+              <w:top w:val="nil"/>
+              <w:left w:val="nil"/>
+              <w:bottom w:val="nil"/>
+              <w:right w:val="nil"/>
+            </w:tcBorders>
+            <w:tcMar>
+              <w:top w:w="0" w:type="dxa"/>
+              <w:left w:w="60" w:type="dxa"/>
+              <w:bottom w:w="0" w:type="dxa"/>
+              <w:right w:w="60" w:type="dxa"/>
+            </w:tcMar>
+            <w:vAlign w:val="bottom"/>
+          </w:tcPr>
+          <w:p>
+            <w:pPr>
+              <w:pStyle w:val="TableText"/>
+              <w:ind w:left="0" w:hanging="56"/>
+            </w:pPr>
+            <w:r>
+              <w:t>  Actual</w:t>
+            </w:r>
+          </w:p>
+        </w:tc>
+        <w:tc>
+          <w:tcPr>
+            <w:tcW w:w="1137" w:type="dxa"/>
+            <w:tcBorders>
+              <w:top w:val="nil"/>
+              <w:left w:val="nil"/>
+              <w:bottom w:val="nil"/>
+              <w:right w:val="nil"/>
+            </w:tcBorders>
+            <w:tcMar>
+              <w:top w:w="0" w:type="dxa"/>
+              <w:left w:w="0" w:type="dxa"/>
+              <w:bottom w:w="0" w:type="dxa"/>
+              <w:right w:w="0" w:type="dxa"/>
+            </w:tcMar>
+          </w:tcPr>
+          <w:p>
+            <w:pPr>
+              <w:pStyle w:val="TableNumber"/>
+            </w:pPr>
+            <w:r>
+              <w:t>7.5</w:t>
+            </w:r>
+          </w:p>
+        </w:tc>
+        <w:tc>
+          <w:tcPr>
+            <w:tcW w:w="1138" w:type="dxa"/>
+            <w:tcBorders>
+              <w:top w:val="nil"/>
+              <w:left w:val="nil"/>
+              <w:bottom w:val="nil"/>
+              <w:right w:val="nil"/>
+            </w:tcBorders>
+            <w:tcMar>
+              <w:top w:w="0" w:type="dxa"/>
+              <w:left w:w="0" w:type="dxa"/>
+              <w:bottom w:w="0" w:type="dxa"/>
+              <w:right w:w="0" w:type="dxa"/>
+            </w:tcMar>
+          </w:tcPr>
+          <w:p>
+            <w:pPr>
+              <w:pStyle w:val="TableNumber"/>
+            </w:pPr>
+            <w:r>
+              <w:t>5.3</w:t>
+            </w:r>
+          </w:p>
+        </w:tc>
+        <w:tc>
+          <w:tcPr>
+            <w:tcW w:w="1139" w:type="dxa"/>
+            <w:tcBorders>
+              <w:top w:val="nil"/>
+              <w:left w:val="nil"/>
+              <w:bottom w:val="nil"/>
+              <w:right w:val="nil"/>
+            </w:tcBorders>
+          </w:tcPr>
+          <w:p>
+            <w:pPr>
+              <w:pStyle w:val="TableNumber"/>
+              <w:ind w:right="-76"/>
+            </w:pPr>
+            <w:r>
+              <w:t xml:space="preserve">–      </w:t>
+            </w:r>
+          </w:p>
+        </w:tc>
+        <w:tc>
+          <w:tcPr>
+            <w:tcW w:w="1138" w:type="dxa"/>
+            <w:tcBorders>
+              <w:top w:val="nil"/>
+              <w:left w:val="nil"/>
+              <w:bottom w:val="nil"/>
+              <w:right w:val="nil"/>
+            </w:tcBorders>
+            <w:tcMar>
+              <w:top w:w="0" w:type="dxa"/>
+              <w:left w:w="0" w:type="dxa"/>
+              <w:bottom w:w="0" w:type="dxa"/>
+              <w:right w:w="0" w:type="dxa"/>
+            </w:tcMar>
+          </w:tcPr>
+          <w:p>
+            <w:pPr>
+              <w:pStyle w:val="TableNumber"/>
+            </w:pPr>
+            <w:r>
+              <w:t xml:space="preserve">–       </w:t>
+            </w:r>
+          </w:p>
+        </w:tc>
+      </w:tr>
+      <w:tr>
+        <w:tc>
+          <w:tcPr>
+            <w:tcW w:w="5215" w:type="dxa"/>
+            <w:tcBorders>
+              <w:top w:val="nil"/>
+              <w:left w:val="nil"/>
+              <w:bottom w:val="nil"/>
+              <w:right w:val="nil"/>
+            </w:tcBorders>
+            <w:tcMar>
+              <w:top w:w="0" w:type="dxa"/>
+              <w:left w:w="60" w:type="dxa"/>
+              <w:bottom w:w="0" w:type="dxa"/>
+              <w:right w:w="60" w:type="dxa"/>
+            </w:tcMar>
+            <w:vAlign w:val="bottom"/>
+          </w:tcPr>
+          <w:p>
+            <w:pPr>
+              <w:pStyle w:val="TableTextBold"/>
+              <w:ind w:left="0" w:hanging="56"/>
+            </w:pPr>
+            <w:r>
+              <w:t xml:space="preserve">Consumer </w:t>
+            </w:r>
+            <w:r>
+              <w:t>P</w:t>
+            </w:r>
+            <w:r>
+              <w:t xml:space="preserve">rice </w:t>
+            </w:r>
+            <w:r>
+              <w:t>I</w:t>
+            </w:r>
+            <w:r>
+              <w:t xml:space="preserve">ndex </w:t>
+            </w:r>
+            <w:r>
+              <w:t>i</w:t>
+            </w:r>
+            <w:r>
+              <w:t>nflation</w:t>
+            </w:r>
+          </w:p>
+        </w:tc>
+        <w:tc>
+          <w:tcPr>
+            <w:tcW w:w="1137" w:type="dxa"/>
+            <w:tcBorders>
+              <w:top w:val="nil"/>
+              <w:left w:val="nil"/>
+              <w:bottom w:val="nil"/>
+              <w:right w:val="nil"/>
+            </w:tcBorders>
+            <w:tcMar>
+              <w:top w:w="0" w:type="dxa"/>
+              <w:left w:w="0" w:type="dxa"/>
+              <w:bottom w:w="0" w:type="dxa"/>
+              <w:right w:w="0" w:type="dxa"/>
+            </w:tcMar>
+          </w:tcPr>
+          <w:p>
+            <w:pPr>
+              <w:pStyle w:val="TableNumber"/>
+            </w:pPr>
+          </w:p>
+        </w:tc>
+        <w:tc>
+          <w:tcPr>
+            <w:tcW w:w="1138" w:type="dxa"/>
+            <w:tcBorders>
+              <w:top w:val="nil"/>
+              <w:left w:val="nil"/>
+              <w:bottom w:val="nil"/>
+              <w:right w:val="nil"/>
+            </w:tcBorders>
+            <w:tcMar>
+              <w:top w:w="0" w:type="dxa"/>
+              <w:left w:w="0" w:type="dxa"/>
+              <w:bottom w:w="0" w:type="dxa"/>
+              <w:right w:w="0" w:type="dxa"/>
+            </w:tcMar>
+          </w:tcPr>
+          <w:p>
+            <w:pPr>
+              <w:pStyle w:val="TableNumber"/>
+            </w:pPr>
+          </w:p>
+        </w:tc>
+        <w:tc>
+          <w:tcPr>
+            <w:tcW w:w="1139" w:type="dxa"/>
+            <w:tcBorders>
+              <w:top w:val="nil"/>
+              <w:left w:val="nil"/>
+              <w:bottom w:val="nil"/>
+              <w:right w:val="nil"/>
+            </w:tcBorders>
+          </w:tcPr>
+          <w:p>
+            <w:pPr>
+              <w:pStyle w:val="TableNumber"/>
+              <w:ind w:right="-76"/>
+            </w:pPr>
+          </w:p>
+        </w:tc>
+        <w:tc>
+          <w:tcPr>
+            <w:tcW w:w="1138" w:type="dxa"/>
+            <w:tcBorders>
+              <w:top w:val="nil"/>
+              <w:left w:val="nil"/>
+              <w:bottom w:val="nil"/>
+              <w:right w:val="nil"/>
+            </w:tcBorders>
+            <w:tcMar>
+              <w:top w:w="0" w:type="dxa"/>
+              <w:left w:w="0" w:type="dxa"/>
+              <w:bottom w:w="0" w:type="dxa"/>
+              <w:right w:w="0" w:type="dxa"/>
+            </w:tcMar>
+          </w:tcPr>
+          <w:p>
+            <w:pPr>
+              <w:pStyle w:val="TableNumber"/>
+            </w:pPr>
+          </w:p>
+        </w:tc>
+      </w:tr>
+      <w:tr>
+        <w:tc>
+          <w:tcPr>
+            <w:tcW w:w="5215" w:type="dxa"/>
+            <w:tcBorders>
+              <w:top w:val="nil"/>
+              <w:left w:val="nil"/>
+              <w:bottom w:val="nil"/>
+              <w:right w:val="nil"/>
+            </w:tcBorders>
+            <w:tcMar>
+              <w:top w:w="0" w:type="dxa"/>
+              <w:left w:w="60" w:type="dxa"/>
+              <w:bottom w:w="0" w:type="dxa"/>
+              <w:right w:w="60" w:type="dxa"/>
+            </w:tcMar>
+            <w:vAlign w:val="bottom"/>
+          </w:tcPr>
+          <w:p>
+            <w:pPr>
+              <w:pStyle w:val="TableText"/>
+              <w:ind w:left="0" w:hanging="56"/>
+            </w:pPr>
+            <w:r>
+              <w:t>  </w:t>
+            </w:r>
+            <w:r>
+              <w:t>Budget 20</w:t>
+            </w:r>
+            <w:r>
+              <w:t>22</w:t>
+            </w:r>
+          </w:p>
+        </w:tc>
+        <w:tc>
+          <w:tcPr>
+            <w:tcW w:w="1137" w:type="dxa"/>
+            <w:tcBorders>
+              <w:top w:val="nil"/>
+              <w:left w:val="nil"/>
+              <w:bottom w:val="nil"/>
+              <w:right w:val="nil"/>
+            </w:tcBorders>
+            <w:tcMar>
+              <w:top w:w="0" w:type="dxa"/>
+              <w:left w:w="0" w:type="dxa"/>
+              <w:bottom w:w="0" w:type="dxa"/>
+              <w:right w:w="0" w:type="dxa"/>
+            </w:tcMar>
+          </w:tcPr>
+          <w:p>
+            <w:pPr>
+              <w:pStyle w:val="TableNumber"/>
+            </w:pPr>
+            <w:r>
+              <w:t>3.4</w:t>
+            </w:r>
+          </w:p>
+        </w:tc>
+        <w:tc>
+          <w:tcPr>
+            <w:tcW w:w="1138" w:type="dxa"/>
+            <w:tcBorders>
+              <w:top w:val="nil"/>
+              <w:left w:val="nil"/>
+              <w:bottom w:val="nil"/>
+              <w:right w:val="nil"/>
+            </w:tcBorders>
+            <w:tcMar>
+              <w:top w:w="0" w:type="dxa"/>
+              <w:left w:w="0" w:type="dxa"/>
+              <w:bottom w:w="0" w:type="dxa"/>
+              <w:right w:w="0" w:type="dxa"/>
+            </w:tcMar>
+          </w:tcPr>
+          <w:p>
+            <w:pPr>
+              <w:pStyle w:val="TableNumber"/>
+            </w:pPr>
+            <w:r>
+              <w:t>3.9</w:t>
+            </w:r>
+          </w:p>
+        </w:tc>
+        <w:tc>
+          <w:tcPr>
+            <w:tcW w:w="1139" w:type="dxa"/>
+            <w:tcBorders>
+              <w:top w:val="nil"/>
+              <w:left w:val="nil"/>
+              <w:bottom w:val="nil"/>
+              <w:right w:val="nil"/>
+            </w:tcBorders>
+          </w:tcPr>
+          <w:p>
+            <w:pPr>
+              <w:pStyle w:val="TableNumber"/>
+              <w:ind w:right="-76"/>
+            </w:pPr>
+            <w:r>
+              <w:t>2.</w:t>
+            </w:r>
+            <w:r>
+              <w:t>4</w:t>
+            </w:r>
+          </w:p>
+        </w:tc>
+        <w:tc>
+          <w:tcPr>
+            <w:tcW w:w="1138" w:type="dxa"/>
+            <w:tcBorders>
+              <w:top w:val="nil"/>
+              <w:left w:val="nil"/>
+              <w:bottom w:val="nil"/>
+              <w:right w:val="nil"/>
+            </w:tcBorders>
+            <w:tcMar>
+              <w:top w:w="0" w:type="dxa"/>
+              <w:left w:w="0" w:type="dxa"/>
+              <w:bottom w:w="0" w:type="dxa"/>
+              <w:right w:w="0" w:type="dxa"/>
+            </w:tcMar>
+          </w:tcPr>
+          <w:p>
+            <w:pPr>
+              <w:pStyle w:val="TableNumber"/>
+            </w:pPr>
+            <w:r>
+              <w:t>2.</w:t>
+            </w:r>
+            <w:r>
+              <w:t>2</w:t>
+            </w:r>
+          </w:p>
+        </w:tc>
+      </w:tr>
+      <w:tr>
+        <w:tc>
+          <w:tcPr>
+            <w:tcW w:w="5215" w:type="dxa"/>
+            <w:tcBorders>
+              <w:top w:val="nil"/>
+              <w:left w:val="nil"/>
+              <w:bottom w:val="nil"/>
+              <w:right w:val="nil"/>
+            </w:tcBorders>
+            <w:tcMar>
+              <w:top w:w="0" w:type="dxa"/>
+              <w:left w:w="60" w:type="dxa"/>
+              <w:bottom w:w="0" w:type="dxa"/>
+              <w:right w:w="60" w:type="dxa"/>
+            </w:tcMar>
+            <w:vAlign w:val="bottom"/>
+          </w:tcPr>
+          <w:p>
+            <w:pPr>
+              <w:pStyle w:val="TableText"/>
+              <w:ind w:left="0" w:hanging="56"/>
+              <w:rPr>
+                <w:i/>
+              </w:rPr>
+            </w:pPr>
+            <w:r>
+              <w:t>  </w:t>
+            </w:r>
+            <w:r>
+              <w:t>Budget 202</w:t>
+            </w:r>
+            <w:r>
+              <w:t>3</w:t>
+            </w:r>
+          </w:p>
+        </w:tc>
+        <w:tc>
+          <w:tcPr>
+            <w:tcW w:w="1137" w:type="dxa"/>
+            <w:tcBorders>
+              <w:top w:val="nil"/>
+              <w:left w:val="nil"/>
+              <w:bottom w:val="nil"/>
+              <w:right w:val="nil"/>
+            </w:tcBorders>
+            <w:tcMar>
+              <w:top w:w="0" w:type="dxa"/>
+              <w:left w:w="0" w:type="dxa"/>
+              <w:bottom w:w="0" w:type="dxa"/>
+              <w:right w:w="0" w:type="dxa"/>
+            </w:tcMar>
+          </w:tcPr>
+          <w:p>
+            <w:pPr>
+              <w:pStyle w:val="TableNumber"/>
+            </w:pPr>
+            <w:r>
+              <w:t>3.4</w:t>
+            </w:r>
+          </w:p>
+        </w:tc>
+        <w:tc>
+          <w:tcPr>
+            <w:tcW w:w="1138" w:type="dxa"/>
+            <w:tcBorders>
+              <w:top w:val="nil"/>
+              <w:left w:val="nil"/>
+              <w:bottom w:val="nil"/>
+              <w:right w:val="nil"/>
+            </w:tcBorders>
+            <w:tcMar>
+              <w:top w:w="0" w:type="dxa"/>
+              <w:left w:w="0" w:type="dxa"/>
+              <w:bottom w:w="0" w:type="dxa"/>
+              <w:right w:w="0" w:type="dxa"/>
+            </w:tcMar>
+          </w:tcPr>
+          <w:p>
+            <w:pPr>
+              <w:pStyle w:val="TableNumber"/>
+            </w:pPr>
+            <w:r>
+              <w:t>6.8</w:t>
+            </w:r>
+          </w:p>
+        </w:tc>
+        <w:tc>
+          <w:tcPr>
+            <w:tcW w:w="1139" w:type="dxa"/>
+            <w:tcBorders>
+              <w:top w:val="nil"/>
+              <w:left w:val="nil"/>
+              <w:bottom w:val="nil"/>
+              <w:right w:val="nil"/>
+            </w:tcBorders>
+          </w:tcPr>
+          <w:p>
+            <w:pPr>
+              <w:pStyle w:val="TableNumber"/>
+              <w:ind w:right="-76"/>
+            </w:pPr>
+            <w:r>
+              <w:t>3.</w:t>
+            </w:r>
+            <w:r>
+              <w:t>5</w:t>
+            </w:r>
+          </w:p>
+        </w:tc>
+        <w:tc>
+          <w:tcPr>
+            <w:tcW w:w="1138" w:type="dxa"/>
+            <w:tcBorders>
+              <w:top w:val="nil"/>
+              <w:left w:val="nil"/>
+              <w:bottom w:val="nil"/>
+              <w:right w:val="nil"/>
+            </w:tcBorders>
+            <w:tcMar>
+              <w:top w:w="0" w:type="dxa"/>
+              <w:left w:w="0" w:type="dxa"/>
+              <w:bottom w:w="0" w:type="dxa"/>
+              <w:right w:w="0" w:type="dxa"/>
+            </w:tcMar>
+          </w:tcPr>
+          <w:p>
+            <w:pPr>
+              <w:pStyle w:val="TableNumber"/>
+            </w:pPr>
+            <w:r>
+              <w:t>2.</w:t>
+            </w:r>
+            <w:r>
+              <w:t>1</w:t>
+            </w:r>
+          </w:p>
+        </w:tc>
+      </w:tr>
+      <w:tr>
+        <w:tc>
+          <w:tcPr>
+            <w:tcW w:w="5215" w:type="dxa"/>
+            <w:tcBorders>
+              <w:top w:val="nil"/>
+              <w:left w:val="nil"/>
+              <w:bottom w:val="single" w:sz="4" w:space="0" w:color="000000"/>
+              <w:right w:val="nil"/>
+            </w:tcBorders>
+            <w:tcMar>
+              <w:top w:w="0" w:type="dxa"/>
+              <w:left w:w="60" w:type="dxa"/>
+              <w:bottom w:w="0" w:type="dxa"/>
+              <w:right w:w="60" w:type="dxa"/>
+            </w:tcMar>
+            <w:vAlign w:val="bottom"/>
+          </w:tcPr>
+          <w:p>
+            <w:pPr>
+              <w:pStyle w:val="TableText"/>
+              <w:ind w:left="0" w:hanging="56"/>
+            </w:pPr>
+            <w:r>
+              <w:t>  Actual</w:t>
+            </w:r>
+          </w:p>
+        </w:tc>
+        <w:tc>
+          <w:tcPr>
+            <w:tcW w:w="1137" w:type="dxa"/>
+            <w:tcBorders>
+              <w:top w:val="nil"/>
+              <w:left w:val="nil"/>
+              <w:bottom w:val="single" w:sz="4" w:space="0" w:color="000000"/>
+              <w:right w:val="nil"/>
+            </w:tcBorders>
+            <w:tcMar>
+              <w:top w:w="0" w:type="dxa"/>
+              <w:left w:w="0" w:type="dxa"/>
+              <w:bottom w:w="0" w:type="dxa"/>
+              <w:right w:w="0" w:type="dxa"/>
+            </w:tcMar>
+          </w:tcPr>
+          <w:p>
+            <w:pPr>
+              <w:pStyle w:val="TableNumber"/>
+            </w:pPr>
+            <w:r>
+              <w:t>3.4</w:t>
+            </w:r>
+          </w:p>
+        </w:tc>
+        <w:tc>
+          <w:tcPr>
+            <w:tcW w:w="1138" w:type="dxa"/>
+            <w:tcBorders>
+              <w:top w:val="nil"/>
+              <w:left w:val="nil"/>
+              <w:bottom w:val="single" w:sz="4" w:space="0" w:color="000000"/>
+              <w:right w:val="nil"/>
+            </w:tcBorders>
+            <w:tcMar>
+              <w:top w:w="0" w:type="dxa"/>
+              <w:left w:w="0" w:type="dxa"/>
+              <w:bottom w:w="0" w:type="dxa"/>
+              <w:right w:w="0" w:type="dxa"/>
+            </w:tcMar>
+          </w:tcPr>
+          <w:p>
+            <w:pPr>
+              <w:pStyle w:val="TableNumber"/>
+            </w:pPr>
+            <w:r>
+              <w:t>6.8</w:t>
+            </w:r>
+          </w:p>
+        </w:tc>
+        <w:tc>
+          <w:tcPr>
+            <w:tcW w:w="1139" w:type="dxa"/>
+            <w:tcBorders>
+              <w:top w:val="nil"/>
+              <w:left w:val="nil"/>
+              <w:bottom w:val="single" w:sz="4" w:space="0" w:color="000000"/>
+              <w:right w:val="nil"/>
+            </w:tcBorders>
+          </w:tcPr>
+          <w:p>
+            <w:pPr>
+              <w:pStyle w:val="TableNumber"/>
+              <w:ind w:right="-76"/>
+            </w:pPr>
+            <w:r>
+              <w:t xml:space="preserve">–       </w:t>
+            </w:r>
+          </w:p>
+        </w:tc>
+        <w:tc>
+          <w:tcPr>
+            <w:tcW w:w="1138" w:type="dxa"/>
+            <w:tcBorders>
+              <w:top w:val="nil"/>
+              <w:left w:val="nil"/>
+              <w:bottom w:val="single" w:sz="4" w:space="0" w:color="000000"/>
+              <w:right w:val="nil"/>
+            </w:tcBorders>
+            <w:tcMar>
+              <w:top w:w="0" w:type="dxa"/>
+              <w:left w:w="0" w:type="dxa"/>
+              <w:bottom w:w="0" w:type="dxa"/>
+              <w:right w:w="0" w:type="dxa"/>
+            </w:tcMar>
+          </w:tcPr>
+          <w:p>
+            <w:pPr>
+              <w:pStyle w:val="TableNumber"/>
+            </w:pPr>
+            <w:r>
+              <w:t xml:space="preserve">–       </w:t>
+            </w:r>
+          </w:p>
+        </w:tc>
+      </w:tr>
+    </w:tbl>
+    <w:p>
+      <w:pPr>
+        <w:pStyle w:val="TableNote"/>
+      </w:pPr>
+      <w:r>
+        <w:t>Note: Figures have been restated to reflect the historical revisions in the Canadian System of National Accounts as of the first quarter of 202</w:t>
+      </w:r>
+      <w:r>
+        <w:t>3</w:t>
+      </w:r>
+      <w:r>
+        <w:t xml:space="preserve"> released on May 31, 202</w:t>
+      </w:r>
+      <w:r>
+        <w:t>3</w:t>
+      </w:r>
+      <w:r>
+        <w:t>.</w:t>
+      </w:r>
+    </w:p>
+    <w:p>
+      <w:pPr>
+        <w:spacing w:after="240"/>
+      </w:pPr>
+    </w:p>
+    <w:p>
+      <w:pPr>
+        <w:spacing w:after="240"/>
+      </w:pPr>
+    </w:p>
     <w:sectPr>
       <w:pgSz w:w="12240" w:h="15840"/>
       <w:pgMar w:top="1440" w:right="1440" w:bottom="1440" w:left="1440" w:header="720" w:footer="720" w:gutter="0"/>
@@ -4638,7 +7980,7 @@
 </file>
 
 <file path=word/endnotes.xml><?xml version="1.0" encoding="utf-8"?>
-<w:endnotes xmlns:wpc="http://schemas.microsoft.com/office/word/2010/wordprocessingCanvas" xmlns:cx="http://schemas.microsoft.com/office/drawing/2014/chartex" xmlns:cx1="http://schemas.microsoft.com/office/drawing/2015/9/8/chartex" xmlns:cx2="http://schemas.microsoft.com/office/drawing/2015/10/21/chartex" xmlns:cx3="http://schemas.microsoft.com/office/drawing/2016/5/9/chartex" xmlns:cx4="http://schemas.microsoft.com/office/drawing/2016/5/10/chartex" xmlns:cx5="http://schemas.microsoft.com/office/drawing/2016/5/11/chartex" xmlns:cx6="http://schemas.microsoft.com/office/drawing/2016/5/12/chartex" xmlns:cx7="http://schemas.microsoft.com/office/drawing/2016/5/13/chartex" xmlns:cx8="http://schemas.microsoft.com/office/drawing/2016/5/14/chartex" xmlns:mc="http://schemas.openxmlformats.org/markup-compatibility/2006" xmlns:aink="http://schemas.microsoft.com/office/drawing/2016/ink" xmlns:am3d="http://schemas.microsoft.com/office/drawing/2017/model3d" xmlns:o="urn:schemas-microsoft-com:office:office" xmlns:oel="http://schemas.microsoft.com/office/2019/extlst" xmlns:r="http://schemas.openxmlformats.org/officeDocument/2006/relationships" xmlns:m="http://schemas.openxmlformats.org/officeDocument/2006/math" xmlns:v="urn:schemas-microsoft-com:vml" xmlns:wp14="http://schemas.microsoft.com/office/word/2010/wordprocessingDrawing" xmlns:wp="http://schemas.openxmlformats.org/drawingml/2006/wordprocessingDrawing" xmlns:w10="urn:schemas-microsoft-com:office:word" xmlns:w="http://schemas.openxmlformats.org/wordprocessingml/2006/main" xmlns:w14="http://schemas.microsoft.com/office/word/2010/wordml" xmlns:w15="http://schemas.microsoft.com/office/word/2012/wordml" xmlns:w16cex="http://schemas.microsoft.com/office/word/2018/wordml/cex" xmlns:w16cid="http://schemas.microsoft.com/office/word/2016/wordml/cid" xmlns:w16="http://schemas.microsoft.com/office/word/2018/wordml" xmlns:w16du="http://schemas.microsoft.com/office/word/2023/wordml/word16du" xmlns:w16sdtdh="http://schemas.microsoft.com/office/word/2020/wordml/sdtdatahash" xmlns:w16sdtfl="http://schemas.microsoft.com/office/word/2024/wordml/sdtformatlock" xmlns:w16se="http://schemas.microsoft.com/office/word/2015/wordml/symex" xmlns:wpg="http://schemas.microsoft.com/office/word/2010/wordprocessingGroup" xmlns:wpi="http://schemas.microsoft.com/office/word/2010/wordprocessingInk" xmlns:wne="http://schemas.microsoft.com/office/word/2006/wordml" xmlns:wps="http://schemas.microsoft.com/office/word/2010/wordprocessingShape" mc:Ignorable="w14 w15 w16se w16cid w16 w16cex w16sdtdh w16sdtfl w16du wp14">
+<w:endnotes xmlns:wpc="http://schemas.microsoft.com/office/word/2010/wordprocessingCanvas" xmlns:cx="http://schemas.microsoft.com/office/drawing/2014/chartex" xmlns:cx1="http://schemas.microsoft.com/office/drawing/2015/9/8/chartex" xmlns:cx2="http://schemas.microsoft.com/office/drawing/2015/10/21/chartex" xmlns:cx3="http://schemas.microsoft.com/office/drawing/2016/5/9/chartex" xmlns:cx4="http://schemas.microsoft.com/office/drawing/2016/5/10/chartex" xmlns:cx5="http://schemas.microsoft.com/office/drawing/2016/5/11/chartex" xmlns:cx6="http://schemas.microsoft.com/office/drawing/2016/5/12/chartex" xmlns:cx7="http://schemas.microsoft.com/office/drawing/2016/5/13/chartex" xmlns:cx8="http://schemas.microsoft.com/office/drawing/2016/5/14/chartex" xmlns:mc="http://schemas.openxmlformats.org/markup-compatibility/2006" xmlns:aink="http://schemas.microsoft.com/office/drawing/2016/ink" xmlns:am3d="http://schemas.microsoft.com/office/drawing/2017/model3d" xmlns:o="urn:schemas-microsoft-com:office:office" xmlns:oel="http://schemas.microsoft.com/office/2019/extlst" xmlns:r="http://schemas.openxmlformats.org/officeDocument/2006/relationships" xmlns:m="http://schemas.openxmlformats.org/officeDocument/2006/math" xmlns:v="urn:schemas-microsoft-com:vml" xmlns:wp14="http://schemas.microsoft.com/office/word/2010/wordprocessingDrawing" xmlns:wp="http://schemas.openxmlformats.org/drawingml/2006/wordprocessingDrawing" xmlns:w10="urn:schemas-microsoft-com:office:word" xmlns:w="http://schemas.openxmlformats.org/wordprocessingml/2006/main" xmlns:w14="http://schemas.microsoft.com/office/word/2010/wordml" xmlns:w15="http://schemas.microsoft.com/office/word/2012/wordml" xmlns:w16cex="http://schemas.microsoft.com/office/word/2018/wordml/cex" xmlns:w16cid="http://schemas.microsoft.com/office/word/2016/wordml/cid" xmlns:w16="http://schemas.microsoft.com/office/word/2018/wordml" xmlns:w16sdtdh="http://schemas.microsoft.com/office/word/2020/wordml/sdtdatahash" xmlns:w16se="http://schemas.microsoft.com/office/word/2015/wordml/symex" xmlns:wpg="http://schemas.microsoft.com/office/word/2010/wordprocessingGroup" xmlns:wpi="http://schemas.microsoft.com/office/word/2010/wordprocessingInk" xmlns:wne="http://schemas.microsoft.com/office/word/2006/wordml" xmlns:wps="http://schemas.microsoft.com/office/word/2010/wordprocessingShape" mc:Ignorable="w14 w15 w16se w16cid w16 w16cex w16sdtdh wp14">
   <w:endnote w:type="separator" w:id="-1">
     <w:p>
       <w:pPr>
@@ -4663,7 +8005,7 @@
 </file>
 
 <file path=word/footnotes.xml><?xml version="1.0" encoding="utf-8"?>
-<w:footnotes xmlns:wpc="http://schemas.microsoft.com/office/word/2010/wordprocessingCanvas" xmlns:cx="http://schemas.microsoft.com/office/drawing/2014/chartex" xmlns:cx1="http://schemas.microsoft.com/office/drawing/2015/9/8/chartex" xmlns:cx2="http://schemas.microsoft.com/office/drawing/2015/10/21/chartex" xmlns:cx3="http://schemas.microsoft.com/office/drawing/2016/5/9/chartex" xmlns:cx4="http://schemas.microsoft.com/office/drawing/2016/5/10/chartex" xmlns:cx5="http://schemas.microsoft.com/office/drawing/2016/5/11/chartex" xmlns:cx6="http://schemas.microsoft.com/office/drawing/2016/5/12/chartex" xmlns:cx7="http://schemas.microsoft.com/office/drawing/2016/5/13/chartex" xmlns:cx8="http://schemas.microsoft.com/office/drawing/2016/5/14/chartex" xmlns:mc="http://schemas.openxmlformats.org/markup-compatibility/2006" xmlns:aink="http://schemas.microsoft.com/office/drawing/2016/ink" xmlns:am3d="http://schemas.microsoft.com/office/drawing/2017/model3d" xmlns:o="urn:schemas-microsoft-com:office:office" xmlns:oel="http://schemas.microsoft.com/office/2019/extlst" xmlns:r="http://schemas.openxmlformats.org/officeDocument/2006/relationships" xmlns:m="http://schemas.openxmlformats.org/officeDocument/2006/math" xmlns:v="urn:schemas-microsoft-com:vml" xmlns:wp14="http://schemas.microsoft.com/office/word/2010/wordprocessingDrawing" xmlns:wp="http://schemas.openxmlformats.org/drawingml/2006/wordprocessingDrawing" xmlns:w10="urn:schemas-microsoft-com:office:word" xmlns:w="http://schemas.openxmlformats.org/wordprocessingml/2006/main" xmlns:w14="http://schemas.microsoft.com/office/word/2010/wordml" xmlns:w15="http://schemas.microsoft.com/office/word/2012/wordml" xmlns:w16cex="http://schemas.microsoft.com/office/word/2018/wordml/cex" xmlns:w16cid="http://schemas.microsoft.com/office/word/2016/wordml/cid" xmlns:w16="http://schemas.microsoft.com/office/word/2018/wordml" xmlns:w16du="http://schemas.microsoft.com/office/word/2023/wordml/word16du" xmlns:w16sdtdh="http://schemas.microsoft.com/office/word/2020/wordml/sdtdatahash" xmlns:w16sdtfl="http://schemas.microsoft.com/office/word/2024/wordml/sdtformatlock" xmlns:w16se="http://schemas.microsoft.com/office/word/2015/wordml/symex" xmlns:wpg="http://schemas.microsoft.com/office/word/2010/wordprocessingGroup" xmlns:wpi="http://schemas.microsoft.com/office/word/2010/wordprocessingInk" xmlns:wne="http://schemas.microsoft.com/office/word/2006/wordml" xmlns:wps="http://schemas.microsoft.com/office/word/2010/wordprocessingShape" mc:Ignorable="w14 w15 w16se w16cid w16 w16cex w16sdtdh w16sdtfl w16du wp14">
+<w:footnotes xmlns:wpc="http://schemas.microsoft.com/office/word/2010/wordprocessingCanvas" xmlns:cx="http://schemas.microsoft.com/office/drawing/2014/chartex" xmlns:cx1="http://schemas.microsoft.com/office/drawing/2015/9/8/chartex" xmlns:cx2="http://schemas.microsoft.com/office/drawing/2015/10/21/chartex" xmlns:cx3="http://schemas.microsoft.com/office/drawing/2016/5/9/chartex" xmlns:cx4="http://schemas.microsoft.com/office/drawing/2016/5/10/chartex" xmlns:cx5="http://schemas.microsoft.com/office/drawing/2016/5/11/chartex" xmlns:cx6="http://schemas.microsoft.com/office/drawing/2016/5/12/chartex" xmlns:cx7="http://schemas.microsoft.com/office/drawing/2016/5/13/chartex" xmlns:cx8="http://schemas.microsoft.com/office/drawing/2016/5/14/chartex" xmlns:mc="http://schemas.openxmlformats.org/markup-compatibility/2006" xmlns:aink="http://schemas.microsoft.com/office/drawing/2016/ink" xmlns:am3d="http://schemas.microsoft.com/office/drawing/2017/model3d" xmlns:o="urn:schemas-microsoft-com:office:office" xmlns:oel="http://schemas.microsoft.com/office/2019/extlst" xmlns:r="http://schemas.openxmlformats.org/officeDocument/2006/relationships" xmlns:m="http://schemas.openxmlformats.org/officeDocument/2006/math" xmlns:v="urn:schemas-microsoft-com:vml" xmlns:wp14="http://schemas.microsoft.com/office/word/2010/wordprocessingDrawing" xmlns:wp="http://schemas.openxmlformats.org/drawingml/2006/wordprocessingDrawing" xmlns:w10="urn:schemas-microsoft-com:office:word" xmlns:w="http://schemas.openxmlformats.org/wordprocessingml/2006/main" xmlns:w14="http://schemas.microsoft.com/office/word/2010/wordml" xmlns:w15="http://schemas.microsoft.com/office/word/2012/wordml" xmlns:w16cex="http://schemas.microsoft.com/office/word/2018/wordml/cex" xmlns:w16cid="http://schemas.microsoft.com/office/word/2016/wordml/cid" xmlns:w16="http://schemas.microsoft.com/office/word/2018/wordml" xmlns:w16sdtdh="http://schemas.microsoft.com/office/word/2020/wordml/sdtdatahash" xmlns:w16se="http://schemas.microsoft.com/office/word/2015/wordml/symex" xmlns:wpg="http://schemas.microsoft.com/office/word/2010/wordprocessingGroup" xmlns:wpi="http://schemas.microsoft.com/office/word/2010/wordprocessingInk" xmlns:wne="http://schemas.microsoft.com/office/word/2006/wordml" xmlns:wps="http://schemas.microsoft.com/office/word/2010/wordprocessingShape" mc:Ignorable="w14 w15 w16se w16cid w16 w16cex w16sdtdh wp14">
   <w:footnote w:type="separator" w:id="-1">
     <w:p>
       <w:pPr>
@@ -4723,7 +8065,7 @@
 </file>
 
 <file path=word/numbering.xml><?xml version="1.0" encoding="utf-8"?>
-<w:numbering xmlns:wpc="http://schemas.microsoft.com/office/word/2010/wordprocessingCanvas" xmlns:cx="http://schemas.microsoft.com/office/drawing/2014/chartex" xmlns:cx1="http://schemas.microsoft.com/office/drawing/2015/9/8/chartex" xmlns:cx2="http://schemas.microsoft.com/office/drawing/2015/10/21/chartex" xmlns:cx3="http://schemas.microsoft.com/office/drawing/2016/5/9/chartex" xmlns:cx4="http://schemas.microsoft.com/office/drawing/2016/5/10/chartex" xmlns:cx5="http://schemas.microsoft.com/office/drawing/2016/5/11/chartex" xmlns:cx6="http://schemas.microsoft.com/office/drawing/2016/5/12/chartex" xmlns:cx7="http://schemas.microsoft.com/office/drawing/2016/5/13/chartex" xmlns:cx8="http://schemas.microsoft.com/office/drawing/2016/5/14/chartex" xmlns:mc="http://schemas.openxmlformats.org/markup-compatibility/2006" xmlns:aink="http://schemas.microsoft.com/office/drawing/2016/ink" xmlns:am3d="http://schemas.microsoft.com/office/drawing/2017/model3d" xmlns:o="urn:schemas-microsoft-com:office:office" xmlns:oel="http://schemas.microsoft.com/office/2019/extlst" xmlns:r="http://schemas.openxmlformats.org/officeDocument/2006/relationships" xmlns:m="http://schemas.openxmlformats.org/officeDocument/2006/math" xmlns:v="urn:schemas-microsoft-com:vml" xmlns:wp14="http://schemas.microsoft.com/office/word/2010/wordprocessingDrawing" xmlns:wp="http://schemas.openxmlformats.org/drawingml/2006/wordprocessingDrawing" xmlns:w10="urn:schemas-microsoft-com:office:word" xmlns:w="http://schemas.openxmlformats.org/wordprocessingml/2006/main" xmlns:w14="http://schemas.microsoft.com/office/word/2010/wordml" xmlns:w15="http://schemas.microsoft.com/office/word/2012/wordml" xmlns:w16cex="http://schemas.microsoft.com/office/word/2018/wordml/cex" xmlns:w16cid="http://schemas.microsoft.com/office/word/2016/wordml/cid" xmlns:w16="http://schemas.microsoft.com/office/word/2018/wordml" xmlns:w16du="http://schemas.microsoft.com/office/word/2023/wordml/word16du" xmlns:w16sdtdh="http://schemas.microsoft.com/office/word/2020/wordml/sdtdatahash" xmlns:w16sdtfl="http://schemas.microsoft.com/office/word/2024/wordml/sdtformatlock" xmlns:w16se="http://schemas.microsoft.com/office/word/2015/wordml/symex" xmlns:wpg="http://schemas.microsoft.com/office/word/2010/wordprocessingGroup" xmlns:wpi="http://schemas.microsoft.com/office/word/2010/wordprocessingInk" xmlns:wne="http://schemas.microsoft.com/office/word/2006/wordml" xmlns:wps="http://schemas.microsoft.com/office/word/2010/wordprocessingShape" mc:Ignorable="w14 w15 w16se w16cid w16 w16cex w16sdtdh w16sdtfl w16du wp14">
+<w:numbering xmlns:wpc="http://schemas.microsoft.com/office/word/2010/wordprocessingCanvas" xmlns:cx="http://schemas.microsoft.com/office/drawing/2014/chartex" xmlns:cx1="http://schemas.microsoft.com/office/drawing/2015/9/8/chartex" xmlns:cx2="http://schemas.microsoft.com/office/drawing/2015/10/21/chartex" xmlns:cx3="http://schemas.microsoft.com/office/drawing/2016/5/9/chartex" xmlns:cx4="http://schemas.microsoft.com/office/drawing/2016/5/10/chartex" xmlns:cx5="http://schemas.microsoft.com/office/drawing/2016/5/11/chartex" xmlns:cx6="http://schemas.microsoft.com/office/drawing/2016/5/12/chartex" xmlns:cx7="http://schemas.microsoft.com/office/drawing/2016/5/13/chartex" xmlns:cx8="http://schemas.microsoft.com/office/drawing/2016/5/14/chartex" xmlns:mc="http://schemas.openxmlformats.org/markup-compatibility/2006" xmlns:aink="http://schemas.microsoft.com/office/drawing/2016/ink" xmlns:am3d="http://schemas.microsoft.com/office/drawing/2017/model3d" xmlns:o="urn:schemas-microsoft-com:office:office" xmlns:oel="http://schemas.microsoft.com/office/2019/extlst" xmlns:r="http://schemas.openxmlformats.org/officeDocument/2006/relationships" xmlns:m="http://schemas.openxmlformats.org/officeDocument/2006/math" xmlns:v="urn:schemas-microsoft-com:vml" xmlns:wp14="http://schemas.microsoft.com/office/word/2010/wordprocessingDrawing" xmlns:wp="http://schemas.openxmlformats.org/drawingml/2006/wordprocessingDrawing" xmlns:w10="urn:schemas-microsoft-com:office:word" xmlns:w="http://schemas.openxmlformats.org/wordprocessingml/2006/main" xmlns:w14="http://schemas.microsoft.com/office/word/2010/wordml" xmlns:w15="http://schemas.microsoft.com/office/word/2012/wordml" xmlns:w16cex="http://schemas.microsoft.com/office/word/2018/wordml/cex" xmlns:w16cid="http://schemas.microsoft.com/office/word/2016/wordml/cid" xmlns:w16="http://schemas.microsoft.com/office/word/2018/wordml" xmlns:w16sdtdh="http://schemas.microsoft.com/office/word/2020/wordml/sdtdatahash" xmlns:w16se="http://schemas.microsoft.com/office/word/2015/wordml/symex" xmlns:wpg="http://schemas.microsoft.com/office/word/2010/wordprocessingGroup" xmlns:wpi="http://schemas.microsoft.com/office/word/2010/wordprocessingInk" xmlns:wne="http://schemas.microsoft.com/office/word/2006/wordml" xmlns:wps="http://schemas.microsoft.com/office/word/2010/wordprocessingShape" mc:Ignorable="w14 w15 w16se w16cid w16 w16cex w16sdtdh wp14">
   <w:abstractNum w:abstractNumId="0" w15:restartNumberingAfterBreak="0">
     <w:nsid w:val="63D93D17"/>
     <w:multiLevelType w:val="hybridMultilevel"/>
@@ -4848,7 +8190,7 @@
 </file>
 
 <file path=word/styles.xml><?xml version="1.0" encoding="utf-8"?>
-<w:styles xmlns:mc="http://schemas.openxmlformats.org/markup-compatibility/2006" xmlns:r="http://schemas.openxmlformats.org/officeDocument/2006/relationships" xmlns:w="http://schemas.openxmlformats.org/wordprocessingml/2006/main" xmlns:w14="http://schemas.microsoft.com/office/word/2010/wordml" xmlns:w15="http://schemas.microsoft.com/office/word/2012/wordml" xmlns:w16cex="http://schemas.microsoft.com/office/word/2018/wordml/cex" xmlns:w16cid="http://schemas.microsoft.com/office/word/2016/wordml/cid" xmlns:w16="http://schemas.microsoft.com/office/word/2018/wordml" xmlns:w16du="http://schemas.microsoft.com/office/word/2023/wordml/word16du" xmlns:w16sdtdh="http://schemas.microsoft.com/office/word/2020/wordml/sdtdatahash" xmlns:w16sdtfl="http://schemas.microsoft.com/office/word/2024/wordml/sdtformatlock" xmlns:w16se="http://schemas.microsoft.com/office/word/2015/wordml/symex" mc:Ignorable="w14 w15 w16se w16cid w16 w16cex w16sdtdh w16sdtfl w16du">
+<w:styles xmlns:mc="http://schemas.openxmlformats.org/markup-compatibility/2006" xmlns:r="http://schemas.openxmlformats.org/officeDocument/2006/relationships" xmlns:w="http://schemas.openxmlformats.org/wordprocessingml/2006/main" xmlns:w14="http://schemas.microsoft.com/office/word/2010/wordml" xmlns:w15="http://schemas.microsoft.com/office/word/2012/wordml" xmlns:w16cex="http://schemas.microsoft.com/office/word/2018/wordml/cex" xmlns:w16cid="http://schemas.microsoft.com/office/word/2016/wordml/cid" xmlns:w16="http://schemas.microsoft.com/office/word/2018/wordml" xmlns:w16sdtdh="http://schemas.microsoft.com/office/word/2020/wordml/sdtdatahash" xmlns:w16se="http://schemas.microsoft.com/office/word/2015/wordml/symex" mc:Ignorable="w14 w15 w16se w16cid w16 w16cex w16sdtdh">
   <w:docDefaults>
     <w:rPrDefault>
       <w:rPr>

</xml_diff>

<commit_message>
Update to test document
</commit_message>
<xml_diff>
--- a/test/test-document-doc-to-html.docx
+++ b/test/test-document-doc-to-html.docx
@@ -566,7 +566,15 @@
         <w:t>73.0</w:t>
       </w:r>
       <w:r>
-        <w:t xml:space="preserve"> billion at March 31, 202</w:t>
+        <w:t xml:space="preserve"> billion </w:t>
+      </w:r>
+      <w:proofErr w:type="gramStart"/>
+      <w:r>
+        <w:t>at</w:t>
+      </w:r>
+      <w:proofErr w:type="gramEnd"/>
+      <w:r>
+        <w:t xml:space="preserve"> March 31, 202</w:t>
       </w:r>
       <w:r>
         <w:t>3</w:t>
@@ -4802,6 +4810,144 @@
         </w:tc>
       </w:tr>
     </w:tbl>
+    <w:p>
+      <w:pPr>
+        <w:rPr>
+          <w:lang w:val="en-CA"/>
+        </w:rPr>
+      </w:pPr>
+    </w:p>
+    <w:tbl>
+      <w:tblPr>
+        <w:tblStyle w:val="TableGrid"/>
+        <w:tblW w:w="0" w:type="auto"/>
+        <w:shd w:val="clear" w:color="auto" w:fill="D9D9D9" w:themeFill="background1" w:themeFillShade="D9"/>
+        <w:tblLook w:val="04A0" w:firstRow="1" w:lastRow="0" w:firstColumn="1" w:lastColumn="0" w:noHBand="0" w:noVBand="1"/>
+      </w:tblPr>
+      <w:tblGrid>
+        <w:gridCol w:w="9350"/>
+      </w:tblGrid>
+      <w:tr>
+        <w:tc>
+          <w:tcPr>
+            <w:tcW w:w="10070" w:type="dxa"/>
+            <w:shd w:val="clear" w:color="auto" w:fill="D9D9D9" w:themeFill="background1" w:themeFillShade="D9"/>
+          </w:tcPr>
+          <w:p>
+            <w:pPr>
+              <w:spacing w:before="120" w:after="120"/>
+              <w:rPr>
+                <w:b/>
+              </w:rPr>
+            </w:pPr>
+            <w:r>
+              <w:rPr>
+                <w:b/>
+              </w:rPr>
+              <w:t>Canada’s Capital Budgeting Framework</w:t>
+            </w:r>
+          </w:p>
+          <w:p>
+            <w:pPr>
+              <w:spacing w:after="120"/>
+              <w:rPr>
+                <w:lang w:val="en-CA"/>
+              </w:rPr>
+            </w:pPr>
+            <w:r>
+              <w:rPr>
+                <w:lang w:val="en-CA"/>
+              </w:rPr>
+              <w:t xml:space="preserve">A central factor explaining Canada’s weak productivity performance is chronic underinvestment in business capital. To address this issue and help identify and prioritize investments that enhance Canada’s long-term economic potential, the government is moving toward a new capital budgeting approach that distinguishes its day-to-day operational spending from expenditure that stimulates public and private sector capital formation. </w:t>
+            </w:r>
+          </w:p>
+          <w:p>
+            <w:pPr>
+              <w:spacing w:after="120"/>
+              <w:rPr>
+                <w:lang w:val="en-CA"/>
+              </w:rPr>
+            </w:pPr>
+            <w:r>
+              <w:rPr>
+                <w:lang w:val="en-CA"/>
+              </w:rPr>
+              <w:t xml:space="preserve">This new lens will be applied to the federal budget, while preserving the ability for users to compare information across different </w:t>
+            </w:r>
+            <w:r>
+              <w:rPr>
+                <w:lang w:val="en-CA"/>
+              </w:rPr>
+              <w:t xml:space="preserve">financial </w:t>
+            </w:r>
+            <w:r>
+              <w:rPr>
+                <w:lang w:val="en-CA"/>
+              </w:rPr>
+              <w:t xml:space="preserve">publications, including the </w:t>
+            </w:r>
+            <w:r>
+              <w:rPr>
+                <w:i/>
+                <w:iCs/>
+                <w:lang w:val="en-CA"/>
+              </w:rPr>
+              <w:t>Annual Financial Report of the Government of Canada</w:t>
+            </w:r>
+            <w:r>
+              <w:rPr>
+                <w:lang w:val="en-CA"/>
+              </w:rPr>
+              <w:t>. It is designed to augment—not replace—existing reporting. The capital budgeting framework will improve transparency</w:t>
+            </w:r>
+            <w:r>
+              <w:rPr>
+                <w:lang w:val="en-CA"/>
+              </w:rPr>
+              <w:t xml:space="preserve"> around the government’s budgeting process</w:t>
+            </w:r>
+            <w:r>
+              <w:rPr>
+                <w:lang w:val="en-CA"/>
+              </w:rPr>
+              <w:t xml:space="preserve">, helping to clarify how fiscal choices support future economic capacity. </w:t>
+            </w:r>
+          </w:p>
+          <w:p>
+            <w:pPr>
+              <w:rPr>
+                <w:lang w:val="en-CA"/>
+              </w:rPr>
+            </w:pPr>
+            <w:r>
+              <w:rPr>
+                <w:lang w:val="en-CA"/>
+              </w:rPr>
+              <w:t xml:space="preserve">The overarching objective is to reorient spending toward new investments that catalyze private sector activity, by increasing funding for capital formation and spending less on </w:t>
+            </w:r>
+            <w:r>
+              <w:rPr>
+                <w:lang w:val="en-CA"/>
+              </w:rPr>
+              <w:t>day-to-day</w:t>
+            </w:r>
+            <w:r>
+              <w:rPr>
+                <w:lang w:val="en-CA"/>
+              </w:rPr>
+              <w:t xml:space="preserve"> operations. Over time, this approach is expected to play an important role in fiscal policy. </w:t>
+            </w:r>
+          </w:p>
+        </w:tc>
+      </w:tr>
+    </w:tbl>
+    <w:p>
+      <w:pPr>
+        <w:rPr>
+          <w:lang w:val="en-CA"/>
+        </w:rPr>
+      </w:pPr>
+    </w:p>
     <w:p>
       <w:pPr>
         <w:spacing w:after="240"/>
@@ -5003,7 +5149,6 @@
               <v:path gradientshapeok="t" o:connecttype="rect"/>
             </v:shapetype>
             <v:shape id="Text Box 2" o:spid="_x0000_s1026" type="#_x0000_t202" alt="UNCLASSIFIED - NON CLASSIFIÉ" style="position:absolute;margin-left:139.15pt;margin-top:0;width:190.35pt;height:29.65pt;z-index:251659264;visibility:visible;mso-wrap-style:none;mso-wrap-distance-left:0;mso-wrap-distance-top:0;mso-wrap-distance-right:0;mso-wrap-distance-bottom:0;mso-position-horizontal:right;mso-position-horizontal-relative:page;mso-position-vertical:top;mso-position-vertical-relative:page;v-text-anchor:top" o:gfxdata="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" filled="f" stroked="f">
-              <v:fill o:detectmouseclick="t"/>
               <v:textbox style="mso-fit-shape-to-text:t" inset="0,15pt,20pt,0">
                 <w:txbxContent>
                   <w:p>
@@ -5135,7 +5280,6 @@
               <v:path gradientshapeok="t" o:connecttype="rect"/>
             </v:shapetype>
             <v:shape id="Text Box 3" o:spid="_x0000_s1027" type="#_x0000_t202" alt="UNCLASSIFIED - NON CLASSIFIÉ" style="position:absolute;margin-left:139.15pt;margin-top:0;width:190.35pt;height:29.65pt;z-index:251660288;visibility:visible;mso-wrap-style:none;mso-wrap-distance-left:0;mso-wrap-distance-top:0;mso-wrap-distance-right:0;mso-wrap-distance-bottom:0;mso-position-horizontal:right;mso-position-horizontal-relative:page;mso-position-vertical:top;mso-position-vertical-relative:page;v-text-anchor:top" o:gfxdata="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" filled="f" stroked="f">
-              <v:fill o:detectmouseclick="t"/>
               <v:textbox style="mso-fit-shape-to-text:t" inset="0,15pt,20pt,0">
                 <w:txbxContent>
                   <w:p>
@@ -5267,7 +5411,6 @@
               <v:path gradientshapeok="t" o:connecttype="rect"/>
             </v:shapetype>
             <v:shape id="Text Box 1" o:spid="_x0000_s1028" type="#_x0000_t202" alt="UNCLASSIFIED - NON CLASSIFIÉ" style="position:absolute;margin-left:139.15pt;margin-top:0;width:190.35pt;height:29.65pt;z-index:251658240;visibility:visible;mso-wrap-style:none;mso-wrap-distance-left:0;mso-wrap-distance-top:0;mso-wrap-distance-right:0;mso-wrap-distance-bottom:0;mso-position-horizontal:right;mso-position-horizontal-relative:page;mso-position-vertical:top;mso-position-vertical-relative:page;v-text-anchor:top" o:gfxdata="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" filled="f" stroked="f">
-              <v:fill o:detectmouseclick="t"/>
               <v:textbox style="mso-fit-shape-to-text:t" inset="0,15pt,20pt,0">
                 <w:txbxContent>
                   <w:p>

</xml_diff>